<commit_message>
Fix - kyc file preview for admin
</commit_message>
<xml_diff>
--- a/مهام.docx
+++ b/مهام.docx
@@ -1679,6 +1679,31 @@
     <w:p>
       <w:pPr>
         <w:pStyle w:val="ListParagraph"/>
+        <w:numPr>
+          <w:ilvl w:val="0"/>
+          <w:numId w:val="2"/>
+        </w:numPr>
+        <w:bidi/>
+        <w:rPr>
+          <w:rFonts w:cs="Arial"/>
+          <w:highlight w:val="green"/>
+          <w:rtl/>
+          <w:lang w:bidi="ar-EG"/>
+        </w:rPr>
+      </w:pPr>
+      <w:r>
+        <w:rPr>
+          <w:rFonts w:cs="Arial" w:hint="cs"/>
+          <w:highlight w:val="green"/>
+          <w:rtl/>
+          <w:lang w:bidi="ar-EG"/>
+        </w:rPr>
+        <w:t>اظهار الوثائق المرفوعة في جزء التحقق من الهوية للأدمن فيمكنه فتحها والاطلاع عليها سواء كانت صور او مستندات</w:t>
+      </w:r>
+    </w:p>
+    <w:p>
+      <w:pPr>
+        <w:pStyle w:val="ListParagraph"/>
         <w:bidi/>
         <w:ind w:left="900"/>
         <w:rPr>
@@ -1751,7 +1776,7 @@
           <w:rtl/>
           <w:lang w:bidi="ar-EG"/>
         </w:rPr>
-        <w:t>اظهار الوثائق</w:t>
+        <w:t>عند رفع الوثيقة يجب ان تظهر</w:t>
       </w:r>
       <w:r>
         <w:rPr>
@@ -1760,16 +1785,15 @@
           <w:rtl/>
           <w:lang w:bidi="ar-EG"/>
         </w:rPr>
-        <w:t xml:space="preserve"> المرفوعة</w:t>
-      </w:r>
-      <w:r>
-        <w:rPr>
-          <w:rFonts w:cs="Arial" w:hint="cs"/>
+        <w:t xml:space="preserve"> للمستخدم ك </w:t>
+      </w:r>
+      <w:r>
+        <w:rPr>
+          <w:rFonts w:cs="Arial"/>
           <w:highlight w:val="red"/>
-          <w:rtl/>
-          <w:lang w:bidi="ar-EG"/>
-        </w:rPr>
-        <w:t xml:space="preserve"> في جزء التحقق من الهوية</w:t>
+          <w:lang w:bidi="ar-EG"/>
+        </w:rPr>
+        <w:t>preview</w:t>
       </w:r>
       <w:r>
         <w:rPr>
@@ -1778,298 +1802,364 @@
           <w:rtl/>
           <w:lang w:bidi="ar-EG"/>
         </w:rPr>
+        <w:t xml:space="preserve"> لو كانت صورة او </w:t>
+      </w:r>
+      <w:r>
+        <w:rPr>
+          <w:rFonts w:cs="Arial"/>
+          <w:highlight w:val="red"/>
+          <w:lang w:bidi="ar-EG"/>
+        </w:rPr>
+        <w:t xml:space="preserve">pdf </w:t>
+      </w:r>
+      <w:r>
+        <w:rPr>
+          <w:rFonts w:cs="Arial" w:hint="cs"/>
+          <w:highlight w:val="red"/>
+          <w:rtl/>
+          <w:lang w:bidi="ar-EG"/>
+        </w:rPr>
+        <w:t xml:space="preserve"> حتى يطمئئن المستخدم انه اختار صح مش بس اسم.امتداد</w:t>
+      </w:r>
+    </w:p>
+    <w:p>
+      <w:pPr>
+        <w:pStyle w:val="ListParagraph"/>
+        <w:numPr>
+          <w:ilvl w:val="0"/>
+          <w:numId w:val="5"/>
+        </w:numPr>
+        <w:bidi/>
+        <w:rPr>
+          <w:rFonts w:cs="Arial"/>
+          <w:highlight w:val="yellow"/>
+          <w:rtl/>
+          <w:lang w:bidi="ar-EG"/>
+        </w:rPr>
+      </w:pPr>
+      <w:r>
+        <w:rPr>
+          <w:rFonts w:cs="Arial" w:hint="cs"/>
+          <w:highlight w:val="yellow"/>
+          <w:rtl/>
+          <w:lang w:bidi="ar-EG"/>
+        </w:rPr>
+        <w:t xml:space="preserve">عربي </w:t>
+      </w:r>
+      <w:r>
+        <w:rPr>
+          <w:rFonts w:cs="Arial" w:hint="cs"/>
+          <w:highlight w:val="yellow"/>
+          <w:rtl/>
+          <w:lang w:bidi="ar-EG"/>
+        </w:rPr>
+        <w:t>للاد</w:t>
+      </w:r>
+      <w:r>
+        <w:rPr>
+          <w:rFonts w:cs="Arial" w:hint="cs"/>
+          <w:highlight w:val="yellow"/>
+          <w:rtl/>
+          <w:lang w:bidi="ar-EG"/>
+        </w:rPr>
+        <w:t>من</w:t>
+      </w:r>
+      <w:r>
+        <w:rPr>
+          <w:rFonts w:cs="Arial" w:hint="cs"/>
+          <w:highlight w:val="yellow"/>
+          <w:rtl/>
+          <w:lang w:bidi="ar-EG"/>
+        </w:rPr>
+        <w:t xml:space="preserve"> هو يعمل ك </w:t>
+      </w:r>
+      <w:proofErr w:type="spellStart"/>
+      <w:r>
+        <w:rPr>
+          <w:rFonts w:cs="Arial"/>
+          <w:highlight w:val="yellow"/>
+          <w:lang w:bidi="ar-EG"/>
+        </w:rPr>
+        <w:t>rtl-ltr</w:t>
+      </w:r>
+      <w:proofErr w:type="spellEnd"/>
+      <w:r>
+        <w:rPr>
+          <w:rFonts w:cs="Arial" w:hint="cs"/>
+          <w:highlight w:val="yellow"/>
+          <w:rtl/>
+          <w:lang w:bidi="ar-EG"/>
+        </w:rPr>
+        <w:t xml:space="preserve"> لكن الكلمات نفسها اريد مقابل عربي لها</w:t>
+      </w:r>
+    </w:p>
+    <w:p>
+      <w:pPr>
+        <w:pStyle w:val="ListParagraph"/>
+        <w:numPr>
+          <w:ilvl w:val="0"/>
+          <w:numId w:val="5"/>
+        </w:numPr>
+        <w:bidi/>
+        <w:rPr>
+          <w:rFonts w:cs="Arial"/>
+          <w:rtl/>
+          <w:lang w:bidi="ar-EG"/>
+        </w:rPr>
+      </w:pPr>
+      <w:r>
+        <w:rPr>
+          <w:rFonts w:cs="Arial" w:hint="cs"/>
+          <w:rtl/>
+          <w:lang w:bidi="ar-EG"/>
+        </w:rPr>
+        <w:t xml:space="preserve">مفيش اشعار بيظهر </w:t>
+      </w:r>
+      <w:r>
+        <w:rPr>
+          <w:rFonts w:cs="Arial" w:hint="cs"/>
+          <w:rtl/>
+          <w:lang w:bidi="ar-EG"/>
+        </w:rPr>
+        <w:t>للمستخدم</w:t>
+      </w:r>
+      <w:r>
+        <w:rPr>
+          <w:rFonts w:cs="Arial" w:hint="cs"/>
+          <w:rtl/>
+          <w:lang w:bidi="ar-EG"/>
+        </w:rPr>
         <w:t xml:space="preserve"> </w:t>
       </w:r>
       <w:r>
         <w:rPr>
           <w:rFonts w:cs="Arial" w:hint="cs"/>
-          <w:highlight w:val="red"/>
-          <w:rtl/>
-          <w:lang w:bidi="ar-EG"/>
-        </w:rPr>
-        <w:t>للأدمن فيمكنه فتحها والاطلاع عليها سواء كانت صور او مستندات</w:t>
-      </w:r>
-    </w:p>
-    <w:p>
-      <w:pPr>
-        <w:pStyle w:val="ListParagraph"/>
-        <w:numPr>
-          <w:ilvl w:val="0"/>
-          <w:numId w:val="5"/>
-        </w:numPr>
-        <w:bidi/>
-        <w:rPr>
-          <w:rFonts w:cs="Arial"/>
-          <w:highlight w:val="red"/>
-          <w:rtl/>
-          <w:lang w:bidi="ar-EG"/>
-        </w:rPr>
-      </w:pPr>
-      <w:r>
-        <w:rPr>
-          <w:rFonts w:cs="Arial" w:hint="cs"/>
-          <w:highlight w:val="red"/>
-          <w:rtl/>
-          <w:lang w:bidi="ar-EG"/>
-        </w:rPr>
-        <w:t>عند رفع الوثيقة يجب ان تظهر</w:t>
-      </w:r>
-      <w:r>
-        <w:rPr>
-          <w:rFonts w:cs="Arial" w:hint="cs"/>
-          <w:highlight w:val="red"/>
-          <w:rtl/>
-          <w:lang w:bidi="ar-EG"/>
-        </w:rPr>
-        <w:t xml:space="preserve"> للمستخدم ك </w:t>
-      </w:r>
-      <w:r>
-        <w:rPr>
-          <w:rFonts w:cs="Arial"/>
-          <w:highlight w:val="red"/>
-          <w:lang w:bidi="ar-EG"/>
-        </w:rPr>
-        <w:t>preview</w:t>
-      </w:r>
-      <w:r>
-        <w:rPr>
-          <w:rFonts w:cs="Arial" w:hint="cs"/>
-          <w:highlight w:val="red"/>
-          <w:rtl/>
-          <w:lang w:bidi="ar-EG"/>
-        </w:rPr>
-        <w:t xml:space="preserve"> لو كانت صورة او </w:t>
-      </w:r>
-      <w:r>
-        <w:rPr>
-          <w:rFonts w:cs="Arial"/>
-          <w:highlight w:val="red"/>
-          <w:lang w:bidi="ar-EG"/>
-        </w:rPr>
-        <w:t xml:space="preserve">pdf </w:t>
-      </w:r>
-      <w:r>
-        <w:rPr>
-          <w:rFonts w:cs="Arial" w:hint="cs"/>
-          <w:highlight w:val="red"/>
-          <w:rtl/>
-          <w:lang w:bidi="ar-EG"/>
-        </w:rPr>
-        <w:t xml:space="preserve"> حتى يطمئئن المستخدم انه اختار صح مش بس اسم.امتداد</w:t>
-      </w:r>
-    </w:p>
-    <w:p>
-      <w:pPr>
-        <w:pStyle w:val="ListParagraph"/>
-        <w:numPr>
-          <w:ilvl w:val="0"/>
-          <w:numId w:val="5"/>
-        </w:numPr>
-        <w:bidi/>
-        <w:rPr>
-          <w:rFonts w:cs="Arial"/>
+          <w:rtl/>
+          <w:lang w:bidi="ar-EG"/>
+        </w:rPr>
+        <w:t>عند توثيق هويته</w:t>
+      </w:r>
+    </w:p>
+    <w:p>
+      <w:pPr>
+        <w:bidi/>
+        <w:rPr>
+          <w:rFonts w:cs="Arial"/>
+          <w:lang w:bidi="ar-EG"/>
+        </w:rPr>
+      </w:pPr>
+    </w:p>
+    <w:p>
+      <w:pPr>
+        <w:bidi/>
+        <w:rPr>
+          <w:rFonts w:cs="Arial"/>
+          <w:rtl/>
+          <w:lang w:bidi="ar-EG"/>
+        </w:rPr>
+      </w:pPr>
+      <w:r>
+        <w:rPr>
+          <w:rFonts w:cs="Arial" w:hint="cs"/>
+          <w:noProof/>
           <w:highlight w:val="yellow"/>
-          <w:rtl/>
-          <w:lang w:bidi="ar-EG"/>
-        </w:rPr>
-      </w:pPr>
-      <w:r>
-        <w:rPr>
-          <w:rFonts w:cs="Arial" w:hint="cs"/>
-          <w:highlight w:val="yellow"/>
-          <w:rtl/>
-          <w:lang w:bidi="ar-EG"/>
-        </w:rPr>
-        <w:t xml:space="preserve">عربي </w:t>
-      </w:r>
-      <w:r>
-        <w:rPr>
-          <w:rFonts w:cs="Arial" w:hint="cs"/>
-          <w:highlight w:val="yellow"/>
-          <w:rtl/>
-          <w:lang w:bidi="ar-EG"/>
-        </w:rPr>
-        <w:t>للاد</w:t>
-      </w:r>
-      <w:r>
-        <w:rPr>
-          <w:rFonts w:cs="Arial" w:hint="cs"/>
-          <w:highlight w:val="yellow"/>
-          <w:rtl/>
-          <w:lang w:bidi="ar-EG"/>
-        </w:rPr>
-        <w:t>من</w:t>
-      </w:r>
-      <w:r>
-        <w:rPr>
-          <w:rFonts w:cs="Arial" w:hint="cs"/>
-          <w:highlight w:val="yellow"/>
-          <w:rtl/>
-          <w:lang w:bidi="ar-EG"/>
-        </w:rPr>
-        <w:t xml:space="preserve"> هو يعمل ك </w:t>
+          <w:lang w:bidi="ar-EG"/>
+        </w:rPr>
+        <w:drawing>
+          <wp:inline distT="0" distB="0" distL="0" distR="0" wp14:anchorId="0502B13D" wp14:editId="53562708">
+            <wp:extent cx="5936615" cy="3338830"/>
+            <wp:effectExtent l="0" t="0" r="6985" b="0"/>
+            <wp:docPr id="678514352" name="Picture 2"/>
+            <wp:cNvGraphicFramePr>
+              <a:graphicFrameLocks xmlns:a="http://schemas.openxmlformats.org/drawingml/2006/main" noChangeAspect="1"/>
+            </wp:cNvGraphicFramePr>
+            <a:graphic xmlns:a="http://schemas.openxmlformats.org/drawingml/2006/main">
+              <a:graphicData uri="http://schemas.openxmlformats.org/drawingml/2006/picture">
+                <pic:pic xmlns:pic="http://schemas.openxmlformats.org/drawingml/2006/picture">
+                  <pic:nvPicPr>
+                    <pic:cNvPr id="0" name="Picture 2"/>
+                    <pic:cNvPicPr>
+                      <a:picLocks noChangeAspect="1" noChangeArrowheads="1"/>
+                    </pic:cNvPicPr>
+                  </pic:nvPicPr>
+                  <pic:blipFill>
+                    <a:blip r:embed="rId5">
+                      <a:extLst>
+                        <a:ext uri="{28A0092B-C50C-407E-A947-70E740481C1C}">
+                          <a14:useLocalDpi xmlns:a14="http://schemas.microsoft.com/office/drawing/2010/main" val="0"/>
+                        </a:ext>
+                      </a:extLst>
+                    </a:blip>
+                    <a:srcRect/>
+                    <a:stretch>
+                      <a:fillRect/>
+                    </a:stretch>
+                  </pic:blipFill>
+                  <pic:spPr bwMode="auto">
+                    <a:xfrm>
+                      <a:off x="0" y="0"/>
+                      <a:ext cx="5936615" cy="3338830"/>
+                    </a:xfrm>
+                    <a:prstGeom prst="rect">
+                      <a:avLst/>
+                    </a:prstGeom>
+                    <a:noFill/>
+                    <a:ln>
+                      <a:noFill/>
+                    </a:ln>
+                  </pic:spPr>
+                </pic:pic>
+              </a:graphicData>
+            </a:graphic>
+          </wp:inline>
+        </w:drawing>
+      </w:r>
+    </w:p>
+    <w:p>
+      <w:pPr>
+        <w:bidi/>
+        <w:rPr>
+          <w:rFonts w:cs="Arial"/>
+          <w:rtl/>
+          <w:lang w:bidi="ar-EG"/>
+        </w:rPr>
+      </w:pPr>
+    </w:p>
+    <w:p>
+      <w:pPr>
+        <w:bidi/>
+        <w:rPr>
+          <w:rFonts w:cs="Arial"/>
+          <w:rtl/>
+          <w:lang w:bidi="ar-EG"/>
+        </w:rPr>
+      </w:pPr>
+    </w:p>
+    <w:p>
+      <w:pPr>
+        <w:bidi/>
+        <w:rPr>
+          <w:rFonts w:cs="Arial"/>
+          <w:lang w:bidi="ar-EG"/>
+        </w:rPr>
+      </w:pPr>
+    </w:p>
+    <w:p>
+      <w:pPr>
+        <w:bidi/>
+      </w:pPr>
+    </w:p>
+    <w:p>
+      <w:pPr>
+        <w:bidi/>
+      </w:pPr>
+    </w:p>
+    <w:p>
+      <w:pPr>
+        <w:bidi/>
+        <w:rPr>
+          <w:rFonts w:cs="Arial"/>
+          <w:rtl/>
+          <w:lang w:bidi="ar-EG"/>
+        </w:rPr>
+      </w:pPr>
+    </w:p>
+    <w:p>
+      <w:pPr>
+        <w:rPr>
+          <w:lang w:bidi="ar-EG"/>
+        </w:rPr>
+      </w:pPr>
+      <w:r>
+        <w:rPr>
+          <w:lang w:bidi="ar-EG"/>
+        </w:rPr>
+        <w:t xml:space="preserve">  </w:t>
+      </w:r>
+      <w:proofErr w:type="gramStart"/>
+      <w:r>
+        <w:rPr>
+          <w:lang w:bidi="ar-EG"/>
+        </w:rPr>
+        <w:t>&lt;!--</w:t>
+      </w:r>
+      <w:proofErr w:type="gramEnd"/>
+      <w:r>
+        <w:rPr>
+          <w:lang w:bidi="ar-EG"/>
+        </w:rPr>
+        <w:t xml:space="preserve"> Before --&gt;</w:t>
+      </w:r>
+    </w:p>
+    <w:p>
+      <w:pPr>
+        <w:rPr>
+          <w:lang w:bidi="ar-EG"/>
+        </w:rPr>
+      </w:pPr>
+      <w:proofErr w:type="gramStart"/>
+      <w:r>
+        <w:rPr>
+          <w:lang w:bidi="ar-EG"/>
+        </w:rPr>
+        <w:t xml:space="preserve">{{ </w:t>
       </w:r>
       <w:proofErr w:type="spellStart"/>
       <w:r>
         <w:rPr>
-          <w:rFonts w:cs="Arial"/>
-          <w:highlight w:val="yellow"/>
-          <w:lang w:bidi="ar-EG"/>
-        </w:rPr>
-        <w:t>rtl-ltr</w:t>
+          <w:lang w:bidi="ar-EG"/>
+        </w:rPr>
+        <w:t>p</w:t>
+      </w:r>
+      <w:proofErr w:type="gramEnd"/>
+      <w:r>
+        <w:rPr>
+          <w:lang w:bidi="ar-EG"/>
+        </w:rPr>
+        <w:t>.submittedAt</w:t>
       </w:r>
       <w:proofErr w:type="spellEnd"/>
       <w:r>
         <w:rPr>
-          <w:rFonts w:cs="Arial" w:hint="cs"/>
-          <w:highlight w:val="yellow"/>
-          <w:rtl/>
-          <w:lang w:bidi="ar-EG"/>
-        </w:rPr>
-        <w:t xml:space="preserve"> لكن الكلمات نفسها اريد مقابل عربي لها</w:t>
-      </w:r>
-    </w:p>
-    <w:p>
-      <w:pPr>
-        <w:pStyle w:val="ListParagraph"/>
-        <w:numPr>
-          <w:ilvl w:val="0"/>
-          <w:numId w:val="5"/>
-        </w:numPr>
-        <w:bidi/>
-        <w:rPr>
-          <w:rFonts w:cs="Arial"/>
-          <w:rtl/>
-          <w:lang w:bidi="ar-EG"/>
-        </w:rPr>
-      </w:pPr>
-      <w:r>
-        <w:rPr>
-          <w:rFonts w:cs="Arial" w:hint="cs"/>
-          <w:rtl/>
-          <w:lang w:bidi="ar-EG"/>
-        </w:rPr>
-        <w:t xml:space="preserve">مفيش اشعار بيظهر </w:t>
-      </w:r>
-      <w:r>
-        <w:rPr>
-          <w:rFonts w:cs="Arial" w:hint="cs"/>
-          <w:rtl/>
-          <w:lang w:bidi="ar-EG"/>
-        </w:rPr>
-        <w:t>للمستخدم</w:t>
-      </w:r>
-      <w:r>
-        <w:rPr>
-          <w:rFonts w:cs="Arial" w:hint="cs"/>
-          <w:rtl/>
-          <w:lang w:bidi="ar-EG"/>
-        </w:rPr>
-        <w:t xml:space="preserve"> </w:t>
-      </w:r>
-      <w:r>
-        <w:rPr>
-          <w:rFonts w:cs="Arial" w:hint="cs"/>
-          <w:rtl/>
-          <w:lang w:bidi="ar-EG"/>
-        </w:rPr>
-        <w:t>عند توثيق هويته</w:t>
-      </w:r>
-    </w:p>
-    <w:p>
-      <w:pPr>
-        <w:bidi/>
-        <w:rPr>
-          <w:rFonts w:cs="Arial"/>
-          <w:lang w:bidi="ar-EG"/>
-        </w:rPr>
-      </w:pPr>
-    </w:p>
-    <w:p>
-      <w:pPr>
-        <w:bidi/>
-        <w:rPr>
-          <w:rFonts w:cs="Arial"/>
-          <w:rtl/>
-          <w:lang w:bidi="ar-EG"/>
-        </w:rPr>
-      </w:pPr>
-    </w:p>
-    <w:p>
-      <w:pPr>
-        <w:bidi/>
-        <w:rPr>
-          <w:rFonts w:cs="Arial"/>
-          <w:rtl/>
-          <w:lang w:bidi="ar-EG"/>
-        </w:rPr>
-      </w:pPr>
-    </w:p>
-    <w:p>
-      <w:pPr>
-        <w:bidi/>
-        <w:rPr>
-          <w:rFonts w:cs="Arial"/>
-          <w:rtl/>
-          <w:lang w:bidi="ar-EG"/>
-        </w:rPr>
-      </w:pPr>
-    </w:p>
-    <w:p>
-      <w:pPr>
-        <w:bidi/>
-        <w:rPr>
-          <w:rFonts w:cs="Arial"/>
-          <w:lang w:bidi="ar-EG"/>
-        </w:rPr>
-      </w:pPr>
-    </w:p>
-    <w:p>
-      <w:pPr>
-        <w:bidi/>
-      </w:pPr>
-    </w:p>
-    <w:p>
-      <w:pPr>
-        <w:bidi/>
-      </w:pPr>
-    </w:p>
-    <w:p>
-      <w:pPr>
-        <w:bidi/>
-        <w:rPr>
-          <w:rFonts w:cs="Arial"/>
-          <w:rtl/>
-          <w:lang w:bidi="ar-EG"/>
-        </w:rPr>
-      </w:pPr>
-    </w:p>
-    <w:p>
-      <w:pPr>
-        <w:rPr>
-          <w:lang w:bidi="ar-EG"/>
-        </w:rPr>
-      </w:pPr>
-      <w:r>
-        <w:rPr>
-          <w:lang w:bidi="ar-EG"/>
-        </w:rPr>
-        <w:t xml:space="preserve">  </w:t>
+          <w:lang w:bidi="ar-EG"/>
+        </w:rPr>
+        <w:t xml:space="preserve"> | </w:t>
+      </w:r>
+      <w:proofErr w:type="spellStart"/>
+      <w:r>
+        <w:rPr>
+          <w:lang w:bidi="ar-EG"/>
+        </w:rPr>
+        <w:t>date:'d</w:t>
+      </w:r>
+      <w:proofErr w:type="spellEnd"/>
+      <w:r>
+        <w:rPr>
+          <w:lang w:bidi="ar-EG"/>
+        </w:rPr>
+        <w:t xml:space="preserve"> MMM</w:t>
       </w:r>
       <w:proofErr w:type="gramStart"/>
       <w:r>
         <w:rPr>
           <w:lang w:bidi="ar-EG"/>
         </w:rPr>
-        <w:t>&lt;!--</w:t>
+        <w:t>' }</w:t>
       </w:r>
       <w:proofErr w:type="gramEnd"/>
       <w:r>
         <w:rPr>
           <w:lang w:bidi="ar-EG"/>
         </w:rPr>
-        <w:t xml:space="preserve"> Before --&gt;</w:t>
-      </w:r>
+        <w:t>}</w:t>
+      </w:r>
+    </w:p>
+    <w:p>
+      <w:pPr>
+        <w:rPr>
+          <w:lang w:bidi="ar-EG"/>
+        </w:rPr>
+      </w:pPr>
     </w:p>
     <w:p>
       <w:pPr>
@@ -2082,76 +2172,7 @@
         <w:rPr>
           <w:lang w:bidi="ar-EG"/>
         </w:rPr>
-        <w:t xml:space="preserve">{{ </w:t>
-      </w:r>
-      <w:proofErr w:type="spellStart"/>
-      <w:r>
-        <w:rPr>
-          <w:lang w:bidi="ar-EG"/>
-        </w:rPr>
-        <w:t>p</w:t>
-      </w:r>
-      <w:proofErr w:type="gramEnd"/>
-      <w:r>
-        <w:rPr>
-          <w:lang w:bidi="ar-EG"/>
-        </w:rPr>
-        <w:t>.submittedAt</w:t>
-      </w:r>
-      <w:proofErr w:type="spellEnd"/>
-      <w:r>
-        <w:rPr>
-          <w:lang w:bidi="ar-EG"/>
-        </w:rPr>
-        <w:t xml:space="preserve"> | </w:t>
-      </w:r>
-      <w:proofErr w:type="spellStart"/>
-      <w:r>
-        <w:rPr>
-          <w:lang w:bidi="ar-EG"/>
-        </w:rPr>
-        <w:t>date:'d</w:t>
-      </w:r>
-      <w:proofErr w:type="spellEnd"/>
-      <w:r>
-        <w:rPr>
-          <w:lang w:bidi="ar-EG"/>
-        </w:rPr>
-        <w:t xml:space="preserve"> MMM</w:t>
-      </w:r>
-      <w:proofErr w:type="gramStart"/>
-      <w:r>
-        <w:rPr>
-          <w:lang w:bidi="ar-EG"/>
-        </w:rPr>
-        <w:t>' }</w:t>
-      </w:r>
-      <w:proofErr w:type="gramEnd"/>
-      <w:r>
-        <w:rPr>
-          <w:lang w:bidi="ar-EG"/>
-        </w:rPr>
-        <w:t>}</w:t>
-      </w:r>
-    </w:p>
-    <w:p>
-      <w:pPr>
-        <w:rPr>
-          <w:lang w:bidi="ar-EG"/>
-        </w:rPr>
-      </w:pPr>
-    </w:p>
-    <w:p>
-      <w:pPr>
-        <w:rPr>
-          <w:lang w:bidi="ar-EG"/>
-        </w:rPr>
-      </w:pPr>
-      <w:proofErr w:type="gramStart"/>
-      <w:r>
-        <w:rPr>
-          <w:lang w:bidi="ar-EG"/>
-        </w:rPr>
+        <w:lastRenderedPageBreak/>
         <w:t>&lt;!--</w:t>
       </w:r>
       <w:proofErr w:type="gramEnd"/>

</xml_diff>

<commit_message>
1- Add Feature Kyc Preview for user during submitting 2- Fix Kyc Notification
</commit_message>
<xml_diff>
--- a/مهام.docx
+++ b/مهام.docx
@@ -504,6 +504,8 @@
         <w:bidi/>
         <w:rPr>
           <w:rFonts w:cs="Arial"/>
+          <w:sz w:val="22"/>
+          <w:szCs w:val="22"/>
           <w:rtl/>
           <w:lang w:bidi="ar-EG"/>
         </w:rPr>
@@ -528,1011 +530,1304 @@
         <w:bidi/>
         <w:rPr>
           <w:rFonts w:cs="Arial"/>
+          <w:sz w:val="20"/>
+          <w:szCs w:val="20"/>
+          <w:highlight w:val="green"/>
+          <w:rtl/>
+        </w:rPr>
+      </w:pPr>
+      <w:r>
+        <w:rPr>
+          <w:rFonts w:cs="Arial"/>
+          <w:sz w:val="20"/>
+          <w:szCs w:val="20"/>
+          <w:highlight w:val="green"/>
+          <w:rtl/>
+        </w:rPr>
+        <w:t>عرض عروض الاخرين</w:t>
+      </w:r>
+      <w:r>
+        <w:rPr>
+          <w:rFonts w:cs="Arial" w:hint="cs"/>
+          <w:sz w:val="20"/>
+          <w:szCs w:val="20"/>
+          <w:highlight w:val="green"/>
+          <w:rtl/>
+        </w:rPr>
+        <w:t xml:space="preserve"> للمستقل</w:t>
+      </w:r>
+    </w:p>
+    <w:p>
+      <w:pPr>
+        <w:pStyle w:val="ListParagraph"/>
+        <w:numPr>
+          <w:ilvl w:val="0"/>
+          <w:numId w:val="2"/>
+        </w:numPr>
+        <w:bidi/>
+        <w:rPr>
+          <w:sz w:val="20"/>
+          <w:szCs w:val="20"/>
+          <w:highlight w:val="green"/>
+        </w:rPr>
+      </w:pPr>
+      <w:r>
+        <w:rPr>
+          <w:rFonts w:cs="Arial"/>
+          <w:sz w:val="20"/>
+          <w:szCs w:val="20"/>
+          <w:highlight w:val="green"/>
+          <w:rtl/>
+        </w:rPr>
+        <w:t>اضافة اقسام للمشاريع وتصفية وفرز</w:t>
+      </w:r>
+    </w:p>
+    <w:p>
+      <w:pPr>
+        <w:pStyle w:val="ListParagraph"/>
+        <w:numPr>
+          <w:ilvl w:val="0"/>
+          <w:numId w:val="2"/>
+        </w:numPr>
+        <w:bidi/>
+        <w:rPr>
+          <w:rFonts w:cs="Arial"/>
+          <w:sz w:val="20"/>
+          <w:szCs w:val="20"/>
+          <w:highlight w:val="green"/>
+          <w:rtl/>
+        </w:rPr>
+      </w:pPr>
+      <w:r>
+        <w:rPr>
+          <w:rFonts w:cs="Arial"/>
+          <w:sz w:val="20"/>
+          <w:szCs w:val="20"/>
+          <w:highlight w:val="green"/>
+          <w:rtl/>
+        </w:rPr>
+        <w:t xml:space="preserve">زر اضافة مهمة يختفي في الموبايل </w:t>
+      </w:r>
+    </w:p>
+    <w:p>
+      <w:pPr>
+        <w:pStyle w:val="ListParagraph"/>
+        <w:numPr>
+          <w:ilvl w:val="0"/>
+          <w:numId w:val="2"/>
+        </w:numPr>
+        <w:bidi/>
+        <w:rPr>
+          <w:rFonts w:cs="Arial"/>
+          <w:sz w:val="20"/>
+          <w:szCs w:val="20"/>
+          <w:highlight w:val="green"/>
+          <w:rtl/>
+          <w:lang w:bidi="ar-EG"/>
+        </w:rPr>
+      </w:pPr>
+      <w:r>
+        <w:rPr>
+          <w:rFonts w:cs="Arial" w:hint="cs"/>
+          <w:sz w:val="20"/>
+          <w:szCs w:val="20"/>
+          <w:highlight w:val="green"/>
+          <w:rtl/>
+          <w:lang w:bidi="ar-EG"/>
+        </w:rPr>
+        <w:t>علامة العين جنب الباسوورد</w:t>
+      </w:r>
+    </w:p>
+    <w:p>
+      <w:pPr>
+        <w:pStyle w:val="ListParagraph"/>
+        <w:numPr>
+          <w:ilvl w:val="0"/>
+          <w:numId w:val="2"/>
+        </w:numPr>
+        <w:bidi/>
+        <w:rPr>
+          <w:rFonts w:cs="Arial"/>
+          <w:sz w:val="20"/>
+          <w:szCs w:val="20"/>
+          <w:highlight w:val="green"/>
+          <w:rtl/>
+          <w:lang w:bidi="ar-EG"/>
+        </w:rPr>
+      </w:pPr>
+      <w:r>
+        <w:rPr>
+          <w:rFonts w:cs="Arial" w:hint="cs"/>
+          <w:sz w:val="20"/>
+          <w:szCs w:val="20"/>
+          <w:highlight w:val="green"/>
+          <w:rtl/>
+          <w:lang w:bidi="ar-EG"/>
+        </w:rPr>
+        <w:t>اضافة عرض</w:t>
+      </w:r>
+    </w:p>
+    <w:p>
+      <w:pPr>
+        <w:pStyle w:val="ListParagraph"/>
+        <w:numPr>
+          <w:ilvl w:val="0"/>
+          <w:numId w:val="2"/>
+        </w:numPr>
+        <w:bidi/>
+        <w:rPr>
+          <w:sz w:val="20"/>
+          <w:szCs w:val="20"/>
+          <w:highlight w:val="green"/>
+        </w:rPr>
+      </w:pPr>
+      <w:r>
+        <w:rPr>
+          <w:rFonts w:cs="Arial"/>
+          <w:sz w:val="20"/>
+          <w:szCs w:val="20"/>
+          <w:highlight w:val="green"/>
+          <w:rtl/>
+        </w:rPr>
+        <w:t>حسابي،معرض الاعمال</w:t>
+      </w:r>
+    </w:p>
+    <w:p>
+      <w:pPr>
+        <w:pStyle w:val="ListParagraph"/>
+        <w:numPr>
+          <w:ilvl w:val="0"/>
+          <w:numId w:val="2"/>
+        </w:numPr>
+        <w:bidi/>
+        <w:rPr>
+          <w:sz w:val="20"/>
+          <w:szCs w:val="20"/>
+          <w:highlight w:val="green"/>
+        </w:rPr>
+      </w:pPr>
+      <w:r>
+        <w:rPr>
+          <w:rFonts w:cs="Arial"/>
+          <w:sz w:val="20"/>
+          <w:szCs w:val="20"/>
+          <w:highlight w:val="green"/>
+          <w:rtl/>
+        </w:rPr>
+        <w:t>عرض العرض مع التقييم ورابط الاعمال فقط او تن</w:t>
+      </w:r>
+      <w:r>
+        <w:rPr>
+          <w:rFonts w:cs="Arial" w:hint="cs"/>
+          <w:sz w:val="20"/>
+          <w:szCs w:val="20"/>
+          <w:highlight w:val="green"/>
+          <w:rtl/>
+        </w:rPr>
+        <w:t>ق</w:t>
+      </w:r>
+      <w:r>
+        <w:rPr>
+          <w:rFonts w:cs="Arial"/>
+          <w:sz w:val="20"/>
+          <w:szCs w:val="20"/>
+          <w:highlight w:val="green"/>
+          <w:rtl/>
+        </w:rPr>
+        <w:t xml:space="preserve">يته بال </w:t>
+      </w:r>
+      <w:r>
+        <w:rPr>
+          <w:sz w:val="20"/>
+          <w:szCs w:val="20"/>
+          <w:highlight w:val="green"/>
+        </w:rPr>
+        <w:t>ai</w:t>
+      </w:r>
+      <w:r>
+        <w:rPr>
+          <w:rFonts w:cs="Arial"/>
+          <w:sz w:val="20"/>
+          <w:szCs w:val="20"/>
+          <w:highlight w:val="green"/>
+          <w:rtl/>
+        </w:rPr>
+        <w:t xml:space="preserve"> </w:t>
+      </w:r>
+    </w:p>
+    <w:p>
+      <w:pPr>
+        <w:pStyle w:val="ListParagraph"/>
+        <w:numPr>
+          <w:ilvl w:val="0"/>
+          <w:numId w:val="2"/>
+        </w:numPr>
+        <w:bidi/>
+        <w:rPr>
+          <w:sz w:val="20"/>
+          <w:szCs w:val="20"/>
+          <w:highlight w:val="green"/>
+        </w:rPr>
+      </w:pPr>
+      <w:r>
+        <w:rPr>
+          <w:rFonts w:cs="Arial" w:hint="cs"/>
+          <w:sz w:val="20"/>
+          <w:szCs w:val="20"/>
+          <w:highlight w:val="green"/>
+          <w:rtl/>
+        </w:rPr>
+        <w:t xml:space="preserve"> </w:t>
+      </w:r>
+      <w:r>
+        <w:rPr>
+          <w:rFonts w:cs="Arial"/>
+          <w:sz w:val="20"/>
+          <w:szCs w:val="20"/>
+          <w:highlight w:val="green"/>
+          <w:rtl/>
+        </w:rPr>
+        <w:t>رسائل الخطا مثلا كلمة مرور غير صحيحة او ايميل غير موجود</w:t>
+      </w:r>
+    </w:p>
+    <w:p>
+      <w:pPr>
+        <w:pStyle w:val="ListParagraph"/>
+        <w:numPr>
+          <w:ilvl w:val="0"/>
+          <w:numId w:val="2"/>
+        </w:numPr>
+        <w:bidi/>
+        <w:rPr>
+          <w:sz w:val="20"/>
+          <w:szCs w:val="20"/>
+          <w:highlight w:val="green"/>
+        </w:rPr>
+      </w:pPr>
+      <w:r>
+        <w:rPr>
+          <w:rFonts w:cs="Arial" w:hint="cs"/>
+          <w:sz w:val="20"/>
+          <w:szCs w:val="20"/>
+          <w:highlight w:val="green"/>
+          <w:rtl/>
+        </w:rPr>
+        <w:t xml:space="preserve"> </w:t>
+      </w:r>
+      <w:r>
+        <w:rPr>
+          <w:rFonts w:cs="Arial"/>
+          <w:sz w:val="20"/>
+          <w:szCs w:val="20"/>
+          <w:highlight w:val="green"/>
+          <w:rtl/>
+        </w:rPr>
+        <w:t>تعيين مستقل وبدء المحادثة</w:t>
+      </w:r>
+    </w:p>
+    <w:p>
+      <w:pPr>
+        <w:pStyle w:val="ListParagraph"/>
+        <w:numPr>
+          <w:ilvl w:val="0"/>
+          <w:numId w:val="2"/>
+        </w:numPr>
+        <w:bidi/>
+        <w:rPr>
+          <w:rFonts w:cs="Arial"/>
+          <w:sz w:val="20"/>
+          <w:szCs w:val="20"/>
+          <w:highlight w:val="green"/>
+          <w:lang w:bidi="ar-EG"/>
+        </w:rPr>
+      </w:pPr>
+      <w:r>
+        <w:rPr>
+          <w:rFonts w:cs="Arial" w:hint="cs"/>
+          <w:sz w:val="20"/>
+          <w:szCs w:val="20"/>
+          <w:highlight w:val="green"/>
+          <w:rtl/>
+          <w:lang w:bidi="ar-EG"/>
+        </w:rPr>
+        <w:t>موافقة الادمن على المهمة</w:t>
+      </w:r>
+    </w:p>
+    <w:p>
+      <w:pPr>
+        <w:pStyle w:val="ListParagraph"/>
+        <w:numPr>
+          <w:ilvl w:val="0"/>
+          <w:numId w:val="2"/>
+        </w:numPr>
+        <w:bidi/>
+        <w:rPr>
+          <w:rFonts w:cs="Arial"/>
+          <w:sz w:val="20"/>
+          <w:szCs w:val="20"/>
+          <w:highlight w:val="green"/>
+          <w:lang w:bidi="ar-EG"/>
+        </w:rPr>
+      </w:pPr>
+      <w:r>
+        <w:rPr>
+          <w:rFonts w:cs="Arial" w:hint="cs"/>
+          <w:sz w:val="20"/>
+          <w:szCs w:val="20"/>
+          <w:highlight w:val="green"/>
+          <w:rtl/>
+          <w:lang w:bidi="ar-EG"/>
+        </w:rPr>
+        <w:t>الداشبورد في الناف</w:t>
+      </w:r>
+    </w:p>
+    <w:p>
+      <w:pPr>
+        <w:pStyle w:val="ListParagraph"/>
+        <w:numPr>
+          <w:ilvl w:val="0"/>
+          <w:numId w:val="2"/>
+        </w:numPr>
+        <w:bidi/>
+        <w:rPr>
+          <w:rFonts w:cs="Arial"/>
+          <w:sz w:val="20"/>
+          <w:szCs w:val="20"/>
+          <w:highlight w:val="green"/>
+          <w:lang w:bidi="ar-EG"/>
+        </w:rPr>
+      </w:pPr>
+      <w:r>
+        <w:rPr>
+          <w:rFonts w:cs="Arial" w:hint="cs"/>
+          <w:sz w:val="20"/>
+          <w:szCs w:val="20"/>
+          <w:highlight w:val="green"/>
+          <w:rtl/>
+          <w:lang w:bidi="ar-EG"/>
+        </w:rPr>
+        <w:t>اخفاء اكتب رسالة</w:t>
+      </w:r>
+    </w:p>
+    <w:p>
+      <w:pPr>
+        <w:pStyle w:val="ListParagraph"/>
+        <w:numPr>
+          <w:ilvl w:val="0"/>
+          <w:numId w:val="2"/>
+        </w:numPr>
+        <w:bidi/>
+        <w:rPr>
+          <w:rFonts w:cs="Arial"/>
+          <w:sz w:val="20"/>
+          <w:szCs w:val="20"/>
+          <w:highlight w:val="green"/>
+          <w:rtl/>
+          <w:lang w:bidi="ar-EG"/>
+        </w:rPr>
+      </w:pPr>
+      <w:r>
+        <w:rPr>
+          <w:rFonts w:cs="Arial" w:hint="cs"/>
+          <w:sz w:val="20"/>
+          <w:szCs w:val="20"/>
+          <w:highlight w:val="green"/>
+          <w:rtl/>
+          <w:lang w:bidi="ar-EG"/>
+        </w:rPr>
+        <w:t>في جزء التحقق من الهوية (اضافة جزء في الملف السخصي انه تم التحقق منالهوية او لا ولكن يمكنه ممارسة نشاطه في التطبيق عادي وتظهر بجانب العرض او المهمة)</w:t>
+      </w:r>
+    </w:p>
+    <w:p>
+      <w:pPr>
+        <w:pStyle w:val="ListParagraph"/>
+        <w:numPr>
+          <w:ilvl w:val="0"/>
+          <w:numId w:val="2"/>
+        </w:numPr>
+        <w:bidi/>
+        <w:rPr>
+          <w:rFonts w:cs="Arial"/>
+          <w:sz w:val="20"/>
+          <w:szCs w:val="20"/>
+          <w:highlight w:val="green"/>
+          <w:lang w:bidi="ar-EG"/>
+        </w:rPr>
+      </w:pPr>
+      <w:r>
+        <w:rPr>
+          <w:rFonts w:cs="Arial" w:hint="cs"/>
+          <w:sz w:val="20"/>
+          <w:szCs w:val="20"/>
+          <w:rtl/>
+          <w:lang w:bidi="ar-EG"/>
+        </w:rPr>
+        <w:t xml:space="preserve"> </w:t>
+      </w:r>
+      <w:r>
+        <w:rPr>
+          <w:rFonts w:cs="Arial" w:hint="cs"/>
+          <w:sz w:val="20"/>
+          <w:szCs w:val="20"/>
+          <w:highlight w:val="green"/>
+          <w:rtl/>
+          <w:lang w:bidi="ar-EG"/>
+        </w:rPr>
+        <w:t>لما بضغط على لينك الملف الشخصي بتاع ال</w:t>
+      </w:r>
+      <w:r>
+        <w:rPr>
+          <w:rFonts w:cs="Arial"/>
+          <w:sz w:val="20"/>
+          <w:szCs w:val="20"/>
+          <w:highlight w:val="green"/>
+          <w:lang w:bidi="ar-EG"/>
+        </w:rPr>
+        <w:t xml:space="preserve">bidder </w:t>
+      </w:r>
+      <w:r>
+        <w:rPr>
+          <w:rFonts w:cs="Arial" w:hint="cs"/>
+          <w:sz w:val="20"/>
+          <w:szCs w:val="20"/>
+          <w:highlight w:val="green"/>
+          <w:rtl/>
+          <w:lang w:bidi="ar-EG"/>
+        </w:rPr>
+        <w:t xml:space="preserve"> لا تظهر تفاصيل الملف الشخصي فقط حتى لو ال</w:t>
+      </w:r>
+      <w:r>
+        <w:rPr>
+          <w:rFonts w:cs="Arial"/>
+          <w:sz w:val="20"/>
+          <w:szCs w:val="20"/>
+          <w:highlight w:val="green"/>
+          <w:lang w:bidi="ar-EG"/>
+        </w:rPr>
+        <w:t xml:space="preserve"> bidder </w:t>
+      </w:r>
+      <w:r>
+        <w:rPr>
+          <w:rFonts w:cs="Arial" w:hint="cs"/>
+          <w:sz w:val="20"/>
+          <w:szCs w:val="20"/>
+          <w:highlight w:val="green"/>
+          <w:rtl/>
+          <w:lang w:bidi="ar-EG"/>
+        </w:rPr>
+        <w:t>اكمل ملفه الشخصي</w:t>
+      </w:r>
+    </w:p>
+    <w:p>
+      <w:pPr>
+        <w:pStyle w:val="ListParagraph"/>
+        <w:numPr>
+          <w:ilvl w:val="0"/>
+          <w:numId w:val="2"/>
+        </w:numPr>
+        <w:bidi/>
+        <w:rPr>
+          <w:rFonts w:cs="Arial"/>
+          <w:sz w:val="20"/>
+          <w:szCs w:val="20"/>
+          <w:highlight w:val="green"/>
+          <w:rtl/>
+          <w:lang w:bidi="ar-EG"/>
+        </w:rPr>
+      </w:pPr>
+      <w:r>
+        <w:rPr>
+          <w:rFonts w:cs="Arial" w:hint="cs"/>
+          <w:sz w:val="20"/>
+          <w:szCs w:val="20"/>
+          <w:highlight w:val="green"/>
+          <w:rtl/>
+          <w:lang w:bidi="ar-EG"/>
+        </w:rPr>
+        <w:t>زر اكتب رسال</w:t>
+      </w:r>
+      <w:r>
+        <w:rPr>
+          <w:rFonts w:cs="Arial" w:hint="cs"/>
+          <w:sz w:val="20"/>
+          <w:szCs w:val="20"/>
+          <w:highlight w:val="green"/>
+          <w:rtl/>
+          <w:lang w:bidi="ar-EG"/>
+        </w:rPr>
+        <w:t>ة</w:t>
+      </w:r>
+      <w:r>
+        <w:rPr>
+          <w:rFonts w:cs="Arial" w:hint="cs"/>
+          <w:sz w:val="20"/>
+          <w:szCs w:val="20"/>
+          <w:highlight w:val="green"/>
+          <w:rtl/>
+          <w:lang w:bidi="ar-EG"/>
+        </w:rPr>
+        <w:t xml:space="preserve"> لا يجب ان يظهر الا بين العميل وال </w:t>
+      </w:r>
+      <w:r>
+        <w:rPr>
+          <w:rFonts w:cs="Arial"/>
+          <w:sz w:val="20"/>
+          <w:szCs w:val="20"/>
+          <w:highlight w:val="green"/>
+          <w:lang w:bidi="ar-EG"/>
+        </w:rPr>
+        <w:t xml:space="preserve">bidder </w:t>
+      </w:r>
+      <w:r>
+        <w:rPr>
+          <w:rFonts w:cs="Arial" w:hint="cs"/>
+          <w:sz w:val="20"/>
+          <w:szCs w:val="20"/>
+          <w:highlight w:val="green"/>
+          <w:rtl/>
+          <w:lang w:bidi="ar-EG"/>
+        </w:rPr>
+        <w:t xml:space="preserve">اللي على المهمة لكن بين </w:t>
+      </w:r>
+      <w:r>
+        <w:rPr>
+          <w:rFonts w:cs="Arial"/>
+          <w:sz w:val="20"/>
+          <w:szCs w:val="20"/>
+          <w:highlight w:val="green"/>
+          <w:lang w:bidi="ar-EG"/>
+        </w:rPr>
+        <w:t xml:space="preserve">freelancer </w:t>
+      </w:r>
+      <w:r>
+        <w:rPr>
+          <w:rFonts w:cs="Arial" w:hint="cs"/>
+          <w:sz w:val="20"/>
+          <w:szCs w:val="20"/>
+          <w:highlight w:val="green"/>
+          <w:rtl/>
+          <w:lang w:bidi="ar-EG"/>
+        </w:rPr>
+        <w:t>والاخر لا يجب ان يظهر</w:t>
+      </w:r>
+    </w:p>
+    <w:p>
+      <w:pPr>
+        <w:pStyle w:val="ListParagraph"/>
+        <w:numPr>
+          <w:ilvl w:val="0"/>
+          <w:numId w:val="2"/>
+        </w:numPr>
+        <w:bidi/>
+        <w:rPr>
+          <w:rFonts w:cs="Arial"/>
+          <w:sz w:val="20"/>
+          <w:szCs w:val="20"/>
+          <w:highlight w:val="green"/>
+          <w:rtl/>
+          <w:lang w:bidi="ar-EG"/>
+        </w:rPr>
+      </w:pPr>
+      <w:r>
+        <w:rPr>
+          <w:rFonts w:cs="Arial" w:hint="cs"/>
+          <w:sz w:val="20"/>
+          <w:szCs w:val="20"/>
+          <w:highlight w:val="green"/>
+          <w:rtl/>
+          <w:lang w:bidi="ar-EG"/>
+        </w:rPr>
+        <w:t xml:space="preserve">اول ما الادمن بيسجل دخول بيدخل على داشبورد ولوحة تحكم مهامي انا عايزاه يروح على الادمن بانل على طول </w:t>
+      </w:r>
+      <w:r>
+        <w:rPr>
+          <w:rFonts w:cs="Arial"/>
+          <w:sz w:val="20"/>
+          <w:szCs w:val="20"/>
+          <w:highlight w:val="green"/>
+          <w:lang w:bidi="ar-EG"/>
+        </w:rPr>
+        <w:t>admin/dashboard</w:t>
+      </w:r>
+    </w:p>
+    <w:p>
+      <w:pPr>
+        <w:pStyle w:val="ListParagraph"/>
+        <w:numPr>
+          <w:ilvl w:val="0"/>
+          <w:numId w:val="2"/>
+        </w:numPr>
+        <w:bidi/>
+        <w:rPr>
+          <w:rFonts w:cs="Arial"/>
+          <w:sz w:val="20"/>
+          <w:szCs w:val="20"/>
+          <w:highlight w:val="green"/>
+          <w:rtl/>
+          <w:lang w:bidi="ar-EG"/>
+        </w:rPr>
+      </w:pPr>
+      <w:r>
+        <w:rPr>
+          <w:rFonts w:cs="Arial" w:hint="cs"/>
+          <w:sz w:val="20"/>
+          <w:szCs w:val="20"/>
+          <w:highlight w:val="green"/>
+          <w:rtl/>
+          <w:lang w:bidi="ar-EG"/>
+        </w:rPr>
+        <w:t>الناف بار بتاعت الابليكيشن مش عايزاها تظهر للادمن خالص</w:t>
+      </w:r>
+    </w:p>
+    <w:p>
+      <w:pPr>
+        <w:pStyle w:val="ListParagraph"/>
+        <w:numPr>
+          <w:ilvl w:val="0"/>
+          <w:numId w:val="2"/>
+        </w:numPr>
+        <w:bidi/>
+        <w:rPr>
+          <w:rFonts w:cs="Arial"/>
+          <w:sz w:val="20"/>
+          <w:szCs w:val="20"/>
+          <w:highlight w:val="green"/>
+          <w:rtl/>
+          <w:lang w:bidi="ar-EG"/>
+        </w:rPr>
+      </w:pPr>
+      <w:r>
+        <w:rPr>
+          <w:rFonts w:cs="Arial" w:hint="cs"/>
+          <w:sz w:val="20"/>
+          <w:szCs w:val="20"/>
+          <w:highlight w:val="green"/>
+          <w:rtl/>
+          <w:lang w:bidi="ar-EG"/>
+        </w:rPr>
+        <w:t xml:space="preserve">يوجد مشكلة اخرى وهي تاريخ ال </w:t>
+      </w:r>
+      <w:r>
+        <w:rPr>
+          <w:rFonts w:cs="Arial"/>
+          <w:sz w:val="20"/>
+          <w:szCs w:val="20"/>
+          <w:highlight w:val="green"/>
+          <w:lang w:bidi="ar-EG"/>
+        </w:rPr>
+        <w:t xml:space="preserve">bidding </w:t>
+      </w:r>
+      <w:r>
+        <w:rPr>
+          <w:rFonts w:cs="Arial" w:hint="cs"/>
+          <w:sz w:val="20"/>
+          <w:szCs w:val="20"/>
+          <w:highlight w:val="green"/>
+          <w:rtl/>
+          <w:lang w:bidi="ar-EG"/>
+        </w:rPr>
+        <w:t xml:space="preserve"> اول ما </w:t>
+      </w:r>
+      <w:r>
+        <w:rPr>
+          <w:rFonts w:cs="Arial"/>
+          <w:sz w:val="20"/>
+          <w:szCs w:val="20"/>
+          <w:highlight w:val="green"/>
+          <w:lang w:bidi="ar-EG"/>
+        </w:rPr>
+        <w:t xml:space="preserve">bidder </w:t>
+      </w:r>
+      <w:r>
+        <w:rPr>
+          <w:rFonts w:cs="Arial" w:hint="cs"/>
+          <w:sz w:val="20"/>
+          <w:szCs w:val="20"/>
+          <w:highlight w:val="green"/>
+          <w:rtl/>
+          <w:lang w:bidi="ar-EG"/>
+        </w:rPr>
+        <w:t xml:space="preserve"> يضيف مزايدة يصبح تاريخ ال</w:t>
+      </w:r>
+      <w:r>
+        <w:rPr>
+          <w:rFonts w:cs="Arial"/>
+          <w:sz w:val="20"/>
+          <w:szCs w:val="20"/>
+          <w:highlight w:val="green"/>
+          <w:lang w:bidi="ar-EG"/>
+        </w:rPr>
+        <w:t xml:space="preserve">bidding </w:t>
+      </w:r>
+      <w:r>
+        <w:rPr>
+          <w:rFonts w:cs="Arial" w:hint="cs"/>
+          <w:sz w:val="20"/>
+          <w:szCs w:val="20"/>
+          <w:highlight w:val="green"/>
+          <w:rtl/>
+          <w:lang w:bidi="ar-EG"/>
+        </w:rPr>
+        <w:t>الاحدث هوالاقدم بمقدار يوم والمزايدة الاقدم هي الاحدث بمقدار يوم ايضا</w:t>
+      </w:r>
+    </w:p>
+    <w:p>
+      <w:pPr>
+        <w:pStyle w:val="ListParagraph"/>
+        <w:numPr>
+          <w:ilvl w:val="0"/>
+          <w:numId w:val="2"/>
+        </w:numPr>
+        <w:bidi/>
+        <w:rPr>
+          <w:rFonts w:cs="Arial"/>
+          <w:sz w:val="20"/>
+          <w:szCs w:val="20"/>
+          <w:highlight w:val="green"/>
+          <w:rtl/>
+          <w:lang w:bidi="ar-EG"/>
+        </w:rPr>
+      </w:pPr>
+      <w:r>
+        <w:rPr>
+          <w:rFonts w:cs="Arial" w:hint="cs"/>
+          <w:sz w:val="20"/>
+          <w:szCs w:val="20"/>
+          <w:highlight w:val="green"/>
+          <w:rtl/>
+          <w:lang w:bidi="ar-EG"/>
+        </w:rPr>
+        <w:t xml:space="preserve">اريد اخفاء استمارة تقديم العرض للمزايد الذي قدم عرضا بالفعل </w:t>
+      </w:r>
+    </w:p>
+    <w:p>
+      <w:pPr>
+        <w:pStyle w:val="ListParagraph"/>
+        <w:numPr>
+          <w:ilvl w:val="0"/>
+          <w:numId w:val="2"/>
+        </w:numPr>
+        <w:bidi/>
+        <w:rPr>
+          <w:sz w:val="20"/>
+          <w:szCs w:val="20"/>
+          <w:highlight w:val="green"/>
+        </w:rPr>
+      </w:pPr>
+      <w:r>
+        <w:rPr>
+          <w:rFonts w:cs="Arial"/>
+          <w:sz w:val="20"/>
+          <w:szCs w:val="20"/>
+          <w:highlight w:val="green"/>
+          <w:rtl/>
+        </w:rPr>
+        <w:t>ازالة رمز التاسك من المهمة</w:t>
+      </w:r>
+      <w:r>
+        <w:rPr>
+          <w:rFonts w:cs="Arial" w:hint="cs"/>
+          <w:sz w:val="20"/>
+          <w:szCs w:val="20"/>
+          <w:highlight w:val="green"/>
+          <w:rtl/>
+        </w:rPr>
+        <w:t xml:space="preserve">  في الكارد في الفرونت</w:t>
+      </w:r>
+    </w:p>
+    <w:p>
+      <w:pPr>
+        <w:pStyle w:val="ListParagraph"/>
+        <w:numPr>
+          <w:ilvl w:val="0"/>
+          <w:numId w:val="2"/>
+        </w:numPr>
+        <w:bidi/>
+        <w:rPr>
+          <w:sz w:val="20"/>
+          <w:szCs w:val="20"/>
+          <w:highlight w:val="green"/>
+        </w:rPr>
+      </w:pPr>
+      <w:r>
+        <w:rPr>
+          <w:rFonts w:cs="Arial" w:hint="cs"/>
+          <w:sz w:val="20"/>
+          <w:szCs w:val="20"/>
+          <w:highlight w:val="green"/>
+          <w:rtl/>
+        </w:rPr>
+        <w:t xml:space="preserve"> </w:t>
+      </w:r>
+      <w:r>
+        <w:rPr>
+          <w:rFonts w:cs="Arial"/>
+          <w:sz w:val="20"/>
+          <w:szCs w:val="20"/>
+          <w:highlight w:val="green"/>
+          <w:rtl/>
+        </w:rPr>
+        <w:t>امكانية ارسال رسائل للمتقدمين لمناقشة تفاصيل العمل قبل البدء</w:t>
+      </w:r>
+    </w:p>
+    <w:p>
+      <w:pPr>
+        <w:pStyle w:val="ListParagraph"/>
+        <w:numPr>
+          <w:ilvl w:val="0"/>
+          <w:numId w:val="2"/>
+        </w:numPr>
+        <w:bidi/>
+        <w:rPr>
+          <w:rFonts w:cs="Arial"/>
+          <w:sz w:val="20"/>
+          <w:szCs w:val="20"/>
+          <w:highlight w:val="green"/>
+          <w:rtl/>
+          <w:lang w:bidi="ar-EG"/>
+        </w:rPr>
+      </w:pPr>
+      <w:r>
+        <w:rPr>
+          <w:rFonts w:cs="Arial" w:hint="cs"/>
+          <w:sz w:val="20"/>
+          <w:szCs w:val="20"/>
+          <w:highlight w:val="green"/>
+          <w:rtl/>
+          <w:lang w:bidi="ar-EG"/>
+        </w:rPr>
+        <w:t xml:space="preserve">اريد تعديل جزء الرسائل بحيث يصبح ان عندما يضغط لعميل على زر مراسلة اللي جنب تعين المستقل يفتح نافذة بين العميل وهذا المستقل تمكن العميل من مراسلة المستقل واذا العميل لم يراسل اي رسالة للمستقل ل يجب ان تظهر المحادثة في ليست المحادثات الجانبي </w:t>
+      </w:r>
+    </w:p>
+    <w:p>
+      <w:pPr>
+        <w:pStyle w:val="ListParagraph"/>
+        <w:numPr>
+          <w:ilvl w:val="0"/>
+          <w:numId w:val="2"/>
+        </w:numPr>
+        <w:bidi/>
+        <w:rPr>
+          <w:rFonts w:cs="Arial"/>
+          <w:sz w:val="20"/>
+          <w:szCs w:val="20"/>
+          <w:highlight w:val="green"/>
+          <w:rtl/>
+          <w:lang w:bidi="ar-EG"/>
+        </w:rPr>
+      </w:pPr>
+      <w:r>
+        <w:rPr>
+          <w:rFonts w:cs="Arial" w:hint="cs"/>
+          <w:sz w:val="20"/>
+          <w:szCs w:val="20"/>
+          <w:highlight w:val="green"/>
+          <w:rtl/>
+          <w:lang w:bidi="ar-EG"/>
+        </w:rPr>
+        <w:t xml:space="preserve">اواجه مشكلة ان عندما يرسل العميل رسالة الى </w:t>
+      </w:r>
+      <w:r>
+        <w:rPr>
+          <w:rFonts w:cs="Arial"/>
+          <w:sz w:val="20"/>
+          <w:szCs w:val="20"/>
+          <w:highlight w:val="green"/>
+          <w:lang w:bidi="ar-EG"/>
+        </w:rPr>
+        <w:t xml:space="preserve">bidder1 </w:t>
+      </w:r>
+      <w:r>
+        <w:rPr>
+          <w:rFonts w:cs="Arial" w:hint="cs"/>
+          <w:sz w:val="20"/>
+          <w:szCs w:val="20"/>
+          <w:highlight w:val="green"/>
+          <w:rtl/>
+          <w:lang w:bidi="ar-EG"/>
+        </w:rPr>
+        <w:t xml:space="preserve">مثلا يفضل يعمل لودينج وببقا مش عارفة الراسلة هتوصل امتى ولما بعمل تسجيل خروج وبرجع تاني ادخل الاقيها اتبعتت عادي طيب ليه مش بتظهر على طول او بتتبعت بسرعة </w:t>
+      </w:r>
+    </w:p>
+    <w:p>
+      <w:pPr>
+        <w:pStyle w:val="ListParagraph"/>
+        <w:numPr>
+          <w:ilvl w:val="0"/>
+          <w:numId w:val="2"/>
+        </w:numPr>
+        <w:bidi/>
+        <w:rPr>
+          <w:rFonts w:cs="Arial"/>
+          <w:sz w:val="20"/>
+          <w:szCs w:val="20"/>
+          <w:highlight w:val="green"/>
+          <w:lang w:bidi="ar-EG"/>
+        </w:rPr>
+      </w:pPr>
+      <w:r>
+        <w:rPr>
+          <w:rFonts w:cs="Arial" w:hint="cs"/>
+          <w:sz w:val="20"/>
+          <w:szCs w:val="20"/>
+          <w:highlight w:val="green"/>
+          <w:rtl/>
+          <w:lang w:bidi="ar-EG"/>
+        </w:rPr>
+        <w:t>الايرور دا بيظهرلي لما بفتح الاكونت بحساب المستقل في جزء الشات</w:t>
+      </w:r>
+    </w:p>
+    <w:p>
+      <w:pPr>
+        <w:pStyle w:val="ListParagraph"/>
+        <w:bidi/>
+        <w:ind w:left="360"/>
+        <w:rPr>
+          <w:rFonts w:cs="Arial"/>
+          <w:sz w:val="20"/>
+          <w:szCs w:val="20"/>
+          <w:highlight w:val="green"/>
+          <w:lang w:bidi="ar-EG"/>
+        </w:rPr>
+      </w:pPr>
+      <w:r>
+        <w:rPr>
+          <w:rFonts w:cs="Arial" w:hint="cs"/>
+          <w:sz w:val="20"/>
+          <w:szCs w:val="20"/>
+          <w:highlight w:val="green"/>
+          <w:rtl/>
+          <w:lang w:bidi="ar-EG"/>
+        </w:rPr>
+        <w:t xml:space="preserve"> </w:t>
+      </w:r>
+      <w:r>
+        <w:rPr>
+          <w:rFonts w:cs="Arial"/>
+          <w:sz w:val="20"/>
+          <w:szCs w:val="20"/>
+          <w:highlight w:val="green"/>
+          <w:lang w:bidi="ar-EG"/>
+        </w:rPr>
+        <w:t>XHRGET</w:t>
+      </w:r>
+    </w:p>
+    <w:p>
+      <w:pPr>
+        <w:pStyle w:val="ListParagraph"/>
+        <w:bidi/>
+        <w:ind w:left="360"/>
+        <w:rPr>
+          <w:rFonts w:cs="Arial"/>
+          <w:sz w:val="20"/>
+          <w:szCs w:val="20"/>
+          <w:highlight w:val="green"/>
+          <w:lang w:bidi="ar-EG"/>
+        </w:rPr>
+      </w:pPr>
+      <w:r>
+        <w:rPr>
+          <w:rFonts w:cs="Arial"/>
+          <w:sz w:val="20"/>
+          <w:szCs w:val="20"/>
+          <w:highlight w:val="green"/>
+          <w:lang w:bidi="ar-EG"/>
+        </w:rPr>
+        <w:t>http://localhost:5294/api/chat/conversation/88c8aef3-131f-4cf2-aa60-aa0c26e73d97?page=1&amp;pageSize=50</w:t>
+      </w:r>
+    </w:p>
+    <w:p>
+      <w:pPr>
+        <w:pStyle w:val="ListParagraph"/>
+        <w:bidi/>
+        <w:ind w:left="900"/>
+        <w:rPr>
+          <w:rFonts w:cs="Arial"/>
+          <w:sz w:val="20"/>
+          <w:szCs w:val="20"/>
+          <w:highlight w:val="green"/>
+          <w:lang w:bidi="ar-EG"/>
+        </w:rPr>
+      </w:pPr>
+      <w:r>
+        <w:rPr>
+          <w:rFonts w:cs="Arial"/>
+          <w:sz w:val="20"/>
+          <w:szCs w:val="20"/>
+          <w:highlight w:val="green"/>
+          <w:rtl/>
+          <w:lang w:bidi="ar-EG"/>
+        </w:rPr>
+        <w:t>[</w:t>
+      </w:r>
+      <w:r>
+        <w:rPr>
+          <w:rFonts w:cs="Arial"/>
+          <w:sz w:val="20"/>
+          <w:szCs w:val="20"/>
+          <w:highlight w:val="green"/>
+          <w:lang w:bidi="ar-EG"/>
+        </w:rPr>
+        <w:t>HTTP/1.1 403 Forbidden 1632ms</w:t>
+      </w:r>
+      <w:r>
+        <w:rPr>
+          <w:rFonts w:cs="Arial"/>
+          <w:sz w:val="20"/>
+          <w:szCs w:val="20"/>
+          <w:highlight w:val="green"/>
+          <w:rtl/>
+          <w:lang w:bidi="ar-EG"/>
+        </w:rPr>
+        <w:t>]</w:t>
+      </w:r>
+    </w:p>
+    <w:p>
+      <w:pPr>
+        <w:pStyle w:val="ListParagraph"/>
+        <w:bidi/>
+        <w:ind w:left="900"/>
+        <w:rPr>
+          <w:rFonts w:cs="Arial"/>
+          <w:sz w:val="20"/>
+          <w:szCs w:val="20"/>
+          <w:rtl/>
+          <w:lang w:bidi="ar-EG"/>
+        </w:rPr>
+      </w:pPr>
+      <w:r>
+        <w:rPr>
+          <w:rFonts w:cs="Arial" w:hint="cs"/>
+          <w:sz w:val="20"/>
+          <w:szCs w:val="20"/>
+          <w:highlight w:val="green"/>
+          <w:rtl/>
+          <w:lang w:bidi="ar-EG"/>
+        </w:rPr>
+        <w:t>ولا يتم تحميل الرسائل</w:t>
+      </w:r>
+    </w:p>
+    <w:p>
+      <w:pPr>
+        <w:pStyle w:val="ListParagraph"/>
+        <w:numPr>
+          <w:ilvl w:val="0"/>
+          <w:numId w:val="2"/>
+        </w:numPr>
+        <w:bidi/>
+        <w:rPr>
+          <w:rFonts w:cs="Arial"/>
+          <w:sz w:val="20"/>
+          <w:szCs w:val="20"/>
+          <w:highlight w:val="green"/>
+          <w:rtl/>
+          <w:lang w:bidi="ar-EG"/>
+        </w:rPr>
+      </w:pPr>
+      <w:r>
+        <w:rPr>
+          <w:rFonts w:cs="Arial" w:hint="cs"/>
+          <w:sz w:val="20"/>
+          <w:szCs w:val="20"/>
+          <w:highlight w:val="green"/>
+          <w:rtl/>
+          <w:lang w:bidi="ar-EG"/>
+        </w:rPr>
+        <w:t xml:space="preserve">الكارثة بقا ان المحادثة اللي بين </w:t>
+      </w:r>
+      <w:r>
+        <w:rPr>
+          <w:rFonts w:cs="Arial"/>
+          <w:sz w:val="20"/>
+          <w:szCs w:val="20"/>
+          <w:highlight w:val="green"/>
+          <w:lang w:bidi="ar-EG"/>
+        </w:rPr>
+        <w:t xml:space="preserve">bidder1 </w:t>
+      </w:r>
+      <w:r>
+        <w:rPr>
+          <w:rFonts w:cs="Arial" w:hint="cs"/>
+          <w:sz w:val="20"/>
+          <w:szCs w:val="20"/>
+          <w:highlight w:val="green"/>
+          <w:rtl/>
+          <w:lang w:bidi="ar-EG"/>
+        </w:rPr>
+        <w:t xml:space="preserve">والعميل هي هي المحادثة اللي بين </w:t>
+      </w:r>
+      <w:r>
+        <w:rPr>
+          <w:rFonts w:cs="Arial"/>
+          <w:sz w:val="20"/>
+          <w:szCs w:val="20"/>
+          <w:highlight w:val="green"/>
+          <w:lang w:bidi="ar-EG"/>
+        </w:rPr>
+        <w:t xml:space="preserve">bidder2 </w:t>
+      </w:r>
+      <w:r>
+        <w:rPr>
+          <w:rFonts w:cs="Arial" w:hint="cs"/>
+          <w:sz w:val="20"/>
+          <w:szCs w:val="20"/>
+          <w:highlight w:val="green"/>
+          <w:rtl/>
+          <w:lang w:bidi="ar-EG"/>
+        </w:rPr>
+        <w:t xml:space="preserve">والعميل نفس الرسايل بتبقا ظاهرة للكل </w:t>
+      </w:r>
+    </w:p>
+    <w:p>
+      <w:pPr>
+        <w:pStyle w:val="ListParagraph"/>
+        <w:numPr>
+          <w:ilvl w:val="0"/>
+          <w:numId w:val="2"/>
+        </w:numPr>
+        <w:bidi/>
+        <w:rPr>
+          <w:rFonts w:cs="Arial"/>
           <w:sz w:val="22"/>
           <w:szCs w:val="22"/>
           <w:highlight w:val="green"/>
-          <w:rtl/>
-        </w:rPr>
-      </w:pPr>
-      <w:r>
-        <w:rPr>
-          <w:rFonts w:cs="Arial"/>
+          <w:lang w:bidi="ar-EG"/>
+        </w:rPr>
+      </w:pPr>
+      <w:r>
+        <w:rPr>
+          <w:rFonts w:cs="Arial" w:hint="cs"/>
           <w:sz w:val="22"/>
           <w:szCs w:val="22"/>
           <w:highlight w:val="green"/>
           <w:rtl/>
-        </w:rPr>
-        <w:t>عرض عروض الاخرين</w:t>
-      </w:r>
-      <w:r>
-        <w:rPr>
-          <w:rFonts w:cs="Arial" w:hint="cs"/>
+          <w:lang w:bidi="ar-EG"/>
+        </w:rPr>
+        <w:t>اظهار الوثائق المرفوعة في جزء التحقق من الهوية للأدمن فيمكنه فتحها والاطلاع عليها سواء كانت صور او مستندات</w:t>
+      </w:r>
+    </w:p>
+    <w:p>
+      <w:pPr>
+        <w:pStyle w:val="ListParagraph"/>
+        <w:numPr>
+          <w:ilvl w:val="0"/>
+          <w:numId w:val="2"/>
+        </w:numPr>
+        <w:bidi/>
+        <w:rPr>
+          <w:rFonts w:cs="Arial"/>
           <w:sz w:val="22"/>
           <w:szCs w:val="22"/>
           <w:highlight w:val="green"/>
           <w:rtl/>
-        </w:rPr>
-        <w:t xml:space="preserve"> للمستقل</w:t>
-      </w:r>
-    </w:p>
-    <w:p>
-      <w:pPr>
-        <w:pStyle w:val="ListParagraph"/>
-        <w:numPr>
-          <w:ilvl w:val="0"/>
-          <w:numId w:val="2"/>
-        </w:numPr>
-        <w:bidi/>
-        <w:rPr>
+          <w:lang w:bidi="ar-EG"/>
+        </w:rPr>
+      </w:pPr>
+      <w:r>
+        <w:rPr>
+          <w:rFonts w:cs="Arial" w:hint="cs"/>
           <w:sz w:val="22"/>
           <w:szCs w:val="22"/>
           <w:highlight w:val="green"/>
-        </w:rPr>
-      </w:pPr>
+          <w:rtl/>
+          <w:lang w:bidi="ar-EG"/>
+        </w:rPr>
+        <w:t xml:space="preserve">عند رفع الوثيقة يجب ان تظهر للمستخدم ك </w:t>
+      </w:r>
       <w:r>
         <w:rPr>
           <w:rFonts w:cs="Arial"/>
           <w:sz w:val="22"/>
           <w:szCs w:val="22"/>
           <w:highlight w:val="green"/>
-          <w:rtl/>
-        </w:rPr>
-        <w:t>اضافة اقسام للمشاريع وتصفية وفرز</w:t>
-      </w:r>
-    </w:p>
-    <w:p>
-      <w:pPr>
-        <w:pStyle w:val="ListParagraph"/>
-        <w:numPr>
-          <w:ilvl w:val="0"/>
-          <w:numId w:val="2"/>
-        </w:numPr>
-        <w:bidi/>
-        <w:rPr>
-          <w:rFonts w:cs="Arial"/>
+          <w:lang w:bidi="ar-EG"/>
+        </w:rPr>
+        <w:t>preview</w:t>
+      </w:r>
+      <w:r>
+        <w:rPr>
+          <w:rFonts w:cs="Arial" w:hint="cs"/>
           <w:sz w:val="22"/>
           <w:szCs w:val="22"/>
           <w:highlight w:val="green"/>
           <w:rtl/>
-        </w:rPr>
-      </w:pPr>
+          <w:lang w:bidi="ar-EG"/>
+        </w:rPr>
+        <w:t xml:space="preserve"> لو كانت صورة او </w:t>
+      </w:r>
       <w:r>
         <w:rPr>
           <w:rFonts w:cs="Arial"/>
           <w:sz w:val="22"/>
           <w:szCs w:val="22"/>
           <w:highlight w:val="green"/>
-          <w:rtl/>
-        </w:rPr>
-        <w:t xml:space="preserve">زر اضافة مهمة يختفي في الموبايل </w:t>
-      </w:r>
-    </w:p>
-    <w:p>
-      <w:pPr>
-        <w:pStyle w:val="ListParagraph"/>
-        <w:numPr>
-          <w:ilvl w:val="0"/>
-          <w:numId w:val="2"/>
-        </w:numPr>
-        <w:bidi/>
-        <w:rPr>
-          <w:rFonts w:cs="Arial"/>
+          <w:lang w:bidi="ar-EG"/>
+        </w:rPr>
+        <w:t xml:space="preserve">pdf </w:t>
+      </w:r>
+      <w:r>
+        <w:rPr>
+          <w:rFonts w:cs="Arial" w:hint="cs"/>
           <w:sz w:val="22"/>
           <w:szCs w:val="22"/>
           <w:highlight w:val="green"/>
           <w:rtl/>
           <w:lang w:bidi="ar-EG"/>
         </w:rPr>
-      </w:pPr>
-      <w:r>
-        <w:rPr>
-          <w:rFonts w:cs="Arial" w:hint="cs"/>
+        <w:t xml:space="preserve"> حتى يطمئئن المستخدم انه اختار صح مش بس اسم.امتداد</w:t>
+      </w:r>
+    </w:p>
+    <w:p>
+      <w:pPr>
+        <w:pStyle w:val="ListParagraph"/>
+        <w:numPr>
+          <w:ilvl w:val="0"/>
+          <w:numId w:val="2"/>
+        </w:numPr>
+        <w:bidi/>
+        <w:rPr>
+          <w:rFonts w:cs="Arial"/>
           <w:sz w:val="22"/>
           <w:szCs w:val="22"/>
           <w:highlight w:val="green"/>
           <w:rtl/>
           <w:lang w:bidi="ar-EG"/>
         </w:rPr>
-        <w:t>علامة العين جنب الباسوورد</w:t>
-      </w:r>
-    </w:p>
-    <w:p>
-      <w:pPr>
-        <w:pStyle w:val="ListParagraph"/>
-        <w:numPr>
-          <w:ilvl w:val="0"/>
-          <w:numId w:val="2"/>
-        </w:numPr>
-        <w:bidi/>
-        <w:rPr>
-          <w:rFonts w:cs="Arial"/>
+      </w:pPr>
+      <w:r>
+        <w:rPr>
+          <w:rFonts w:cs="Arial" w:hint="cs"/>
           <w:sz w:val="22"/>
           <w:szCs w:val="22"/>
           <w:highlight w:val="green"/>
           <w:rtl/>
           <w:lang w:bidi="ar-EG"/>
         </w:rPr>
-      </w:pPr>
-      <w:r>
-        <w:rPr>
-          <w:rFonts w:cs="Arial" w:hint="cs"/>
-          <w:sz w:val="22"/>
-          <w:szCs w:val="22"/>
-          <w:highlight w:val="green"/>
-          <w:rtl/>
-          <w:lang w:bidi="ar-EG"/>
-        </w:rPr>
-        <w:t>اضافة عرض</w:t>
-      </w:r>
-    </w:p>
-    <w:p>
-      <w:pPr>
-        <w:pStyle w:val="ListParagraph"/>
-        <w:numPr>
-          <w:ilvl w:val="0"/>
-          <w:numId w:val="2"/>
-        </w:numPr>
-        <w:bidi/>
-        <w:rPr>
-          <w:sz w:val="22"/>
-          <w:szCs w:val="22"/>
-          <w:highlight w:val="green"/>
-        </w:rPr>
-      </w:pPr>
-      <w:r>
-        <w:rPr>
-          <w:rFonts w:cs="Arial"/>
-          <w:sz w:val="22"/>
-          <w:szCs w:val="22"/>
-          <w:highlight w:val="green"/>
-          <w:rtl/>
-        </w:rPr>
-        <w:t>حسابي،معرض الاعمال</w:t>
-      </w:r>
-    </w:p>
-    <w:p>
-      <w:pPr>
-        <w:pStyle w:val="ListParagraph"/>
-        <w:numPr>
-          <w:ilvl w:val="0"/>
-          <w:numId w:val="2"/>
-        </w:numPr>
-        <w:bidi/>
-        <w:rPr>
-          <w:sz w:val="22"/>
-          <w:szCs w:val="22"/>
-          <w:highlight w:val="green"/>
-        </w:rPr>
-      </w:pPr>
-      <w:r>
-        <w:rPr>
-          <w:rFonts w:cs="Arial"/>
-          <w:sz w:val="22"/>
-          <w:szCs w:val="22"/>
-          <w:highlight w:val="green"/>
-          <w:rtl/>
-        </w:rPr>
-        <w:t>عرض العرض مع التقييم ورابط الاعمال فقط او تن</w:t>
-      </w:r>
-      <w:r>
-        <w:rPr>
-          <w:rFonts w:cs="Arial" w:hint="cs"/>
-          <w:sz w:val="22"/>
-          <w:szCs w:val="22"/>
-          <w:highlight w:val="green"/>
-          <w:rtl/>
-        </w:rPr>
-        <w:t>ق</w:t>
-      </w:r>
-      <w:r>
-        <w:rPr>
-          <w:rFonts w:cs="Arial"/>
-          <w:sz w:val="22"/>
-          <w:szCs w:val="22"/>
-          <w:highlight w:val="green"/>
-          <w:rtl/>
-        </w:rPr>
-        <w:t xml:space="preserve">يته بال </w:t>
-      </w:r>
-      <w:r>
-        <w:rPr>
-          <w:sz w:val="22"/>
-          <w:szCs w:val="22"/>
-          <w:highlight w:val="green"/>
-        </w:rPr>
-        <w:t>ai</w:t>
-      </w:r>
-      <w:r>
-        <w:rPr>
-          <w:rFonts w:cs="Arial"/>
-          <w:sz w:val="22"/>
-          <w:szCs w:val="22"/>
-          <w:highlight w:val="green"/>
-          <w:rtl/>
-        </w:rPr>
-        <w:t xml:space="preserve"> </w:t>
-      </w:r>
-    </w:p>
-    <w:p>
-      <w:pPr>
-        <w:pStyle w:val="ListParagraph"/>
-        <w:numPr>
-          <w:ilvl w:val="0"/>
-          <w:numId w:val="2"/>
-        </w:numPr>
-        <w:bidi/>
-        <w:rPr>
-          <w:sz w:val="22"/>
-          <w:szCs w:val="22"/>
-          <w:highlight w:val="green"/>
-        </w:rPr>
-      </w:pPr>
-      <w:r>
-        <w:rPr>
-          <w:rFonts w:cs="Arial" w:hint="cs"/>
-          <w:sz w:val="22"/>
-          <w:szCs w:val="22"/>
-          <w:highlight w:val="green"/>
-          <w:rtl/>
-        </w:rPr>
-        <w:t xml:space="preserve"> </w:t>
-      </w:r>
-      <w:r>
-        <w:rPr>
-          <w:rFonts w:cs="Arial"/>
-          <w:sz w:val="22"/>
-          <w:szCs w:val="22"/>
-          <w:highlight w:val="green"/>
-          <w:rtl/>
-        </w:rPr>
-        <w:t>رسائل الخطا مثلا كلمة مرور غير صحيحة او ايميل غير موجود</w:t>
-      </w:r>
-    </w:p>
-    <w:p>
-      <w:pPr>
-        <w:pStyle w:val="ListParagraph"/>
-        <w:numPr>
-          <w:ilvl w:val="0"/>
-          <w:numId w:val="2"/>
-        </w:numPr>
-        <w:bidi/>
-        <w:rPr>
-          <w:sz w:val="22"/>
-          <w:szCs w:val="22"/>
-          <w:highlight w:val="green"/>
-        </w:rPr>
-      </w:pPr>
-      <w:r>
-        <w:rPr>
-          <w:rFonts w:cs="Arial" w:hint="cs"/>
-          <w:sz w:val="22"/>
-          <w:szCs w:val="22"/>
-          <w:highlight w:val="green"/>
-          <w:rtl/>
-        </w:rPr>
-        <w:t xml:space="preserve"> </w:t>
-      </w:r>
-      <w:r>
-        <w:rPr>
-          <w:rFonts w:cs="Arial"/>
-          <w:sz w:val="22"/>
-          <w:szCs w:val="22"/>
-          <w:highlight w:val="green"/>
-          <w:rtl/>
-        </w:rPr>
-        <w:t>تعيين مستقل وبدء المحادثة</w:t>
-      </w:r>
-    </w:p>
-    <w:p>
-      <w:pPr>
-        <w:pStyle w:val="ListParagraph"/>
-        <w:numPr>
-          <w:ilvl w:val="0"/>
-          <w:numId w:val="2"/>
-        </w:numPr>
-        <w:bidi/>
-        <w:rPr>
-          <w:rFonts w:cs="Arial"/>
-          <w:sz w:val="22"/>
-          <w:szCs w:val="22"/>
-          <w:highlight w:val="green"/>
-          <w:lang w:bidi="ar-EG"/>
-        </w:rPr>
-      </w:pPr>
-      <w:r>
-        <w:rPr>
-          <w:rFonts w:cs="Arial" w:hint="cs"/>
-          <w:sz w:val="22"/>
-          <w:szCs w:val="22"/>
-          <w:highlight w:val="green"/>
-          <w:rtl/>
-          <w:lang w:bidi="ar-EG"/>
-        </w:rPr>
-        <w:t>موافقة الادمن على المهمة</w:t>
-      </w:r>
-    </w:p>
-    <w:p>
-      <w:pPr>
-        <w:pStyle w:val="ListParagraph"/>
-        <w:numPr>
-          <w:ilvl w:val="0"/>
-          <w:numId w:val="2"/>
-        </w:numPr>
-        <w:bidi/>
-        <w:rPr>
-          <w:rFonts w:cs="Arial"/>
-          <w:sz w:val="22"/>
-          <w:szCs w:val="22"/>
-          <w:highlight w:val="green"/>
-          <w:lang w:bidi="ar-EG"/>
-        </w:rPr>
-      </w:pPr>
-      <w:r>
-        <w:rPr>
-          <w:rFonts w:cs="Arial" w:hint="cs"/>
-          <w:sz w:val="22"/>
-          <w:szCs w:val="22"/>
-          <w:highlight w:val="green"/>
-          <w:rtl/>
-          <w:lang w:bidi="ar-EG"/>
-        </w:rPr>
-        <w:t>الداشبورد في الناف</w:t>
-      </w:r>
-    </w:p>
-    <w:p>
-      <w:pPr>
-        <w:pStyle w:val="ListParagraph"/>
-        <w:numPr>
-          <w:ilvl w:val="0"/>
-          <w:numId w:val="2"/>
-        </w:numPr>
-        <w:bidi/>
-        <w:rPr>
-          <w:rFonts w:cs="Arial"/>
-          <w:sz w:val="22"/>
-          <w:szCs w:val="22"/>
-          <w:highlight w:val="green"/>
-          <w:lang w:bidi="ar-EG"/>
-        </w:rPr>
-      </w:pPr>
-      <w:r>
-        <w:rPr>
-          <w:rFonts w:cs="Arial" w:hint="cs"/>
-          <w:sz w:val="22"/>
-          <w:szCs w:val="22"/>
-          <w:highlight w:val="green"/>
-          <w:rtl/>
-          <w:lang w:bidi="ar-EG"/>
-        </w:rPr>
-        <w:t>اخفاء اكتب رسالة</w:t>
-      </w:r>
-    </w:p>
-    <w:p>
-      <w:pPr>
-        <w:pStyle w:val="ListParagraph"/>
-        <w:numPr>
-          <w:ilvl w:val="0"/>
-          <w:numId w:val="2"/>
-        </w:numPr>
-        <w:bidi/>
-        <w:rPr>
-          <w:rFonts w:cs="Arial"/>
-          <w:sz w:val="22"/>
-          <w:szCs w:val="22"/>
-          <w:highlight w:val="green"/>
-          <w:rtl/>
-          <w:lang w:bidi="ar-EG"/>
-        </w:rPr>
-      </w:pPr>
-      <w:r>
-        <w:rPr>
-          <w:rFonts w:cs="Arial" w:hint="cs"/>
-          <w:sz w:val="22"/>
-          <w:szCs w:val="22"/>
-          <w:highlight w:val="green"/>
-          <w:rtl/>
-          <w:lang w:bidi="ar-EG"/>
-        </w:rPr>
-        <w:t>في جزء التحقق من الهوية (اضافة جزء في الملف السخصي انه تم التحقق منالهوية او لا ولكن يمكنه ممارسة نشاطه في التطبيق عادي وتظهر بجانب العرض او المهمة)</w:t>
-      </w:r>
-    </w:p>
-    <w:p>
-      <w:pPr>
-        <w:pStyle w:val="ListParagraph"/>
-        <w:numPr>
-          <w:ilvl w:val="0"/>
-          <w:numId w:val="2"/>
-        </w:numPr>
-        <w:bidi/>
-        <w:rPr>
-          <w:rFonts w:cs="Arial"/>
-          <w:sz w:val="22"/>
-          <w:szCs w:val="22"/>
-          <w:highlight w:val="green"/>
-          <w:lang w:bidi="ar-EG"/>
-        </w:rPr>
-      </w:pPr>
-      <w:r>
-        <w:rPr>
-          <w:rFonts w:cs="Arial" w:hint="cs"/>
-          <w:sz w:val="22"/>
-          <w:szCs w:val="22"/>
-          <w:rtl/>
-          <w:lang w:bidi="ar-EG"/>
-        </w:rPr>
-        <w:t xml:space="preserve"> </w:t>
-      </w:r>
-      <w:r>
-        <w:rPr>
-          <w:rFonts w:cs="Arial" w:hint="cs"/>
-          <w:sz w:val="22"/>
-          <w:szCs w:val="22"/>
-          <w:highlight w:val="green"/>
-          <w:rtl/>
-          <w:lang w:bidi="ar-EG"/>
-        </w:rPr>
-        <w:t>لما بضغط على لينك الملف الشخصي بتاع ال</w:t>
-      </w:r>
-      <w:r>
-        <w:rPr>
-          <w:rFonts w:cs="Arial"/>
-          <w:sz w:val="22"/>
-          <w:szCs w:val="22"/>
-          <w:highlight w:val="green"/>
-          <w:lang w:bidi="ar-EG"/>
-        </w:rPr>
-        <w:t xml:space="preserve">bidder </w:t>
-      </w:r>
-      <w:r>
-        <w:rPr>
-          <w:rFonts w:cs="Arial" w:hint="cs"/>
-          <w:sz w:val="22"/>
-          <w:szCs w:val="22"/>
-          <w:highlight w:val="green"/>
-          <w:rtl/>
-          <w:lang w:bidi="ar-EG"/>
-        </w:rPr>
-        <w:t xml:space="preserve"> لا تظهر تفاصيل الملف الشخصي فقط حتى لو ال</w:t>
-      </w:r>
-      <w:r>
-        <w:rPr>
-          <w:rFonts w:cs="Arial"/>
-          <w:sz w:val="22"/>
-          <w:szCs w:val="22"/>
-          <w:highlight w:val="green"/>
-          <w:lang w:bidi="ar-EG"/>
-        </w:rPr>
-        <w:t xml:space="preserve"> bidder </w:t>
-      </w:r>
-      <w:r>
-        <w:rPr>
-          <w:rFonts w:cs="Arial" w:hint="cs"/>
-          <w:sz w:val="22"/>
-          <w:szCs w:val="22"/>
-          <w:highlight w:val="green"/>
-          <w:rtl/>
-          <w:lang w:bidi="ar-EG"/>
-        </w:rPr>
-        <w:t>اكمل ملفه الشخصي</w:t>
-      </w:r>
-    </w:p>
-    <w:p>
-      <w:pPr>
-        <w:pStyle w:val="ListParagraph"/>
-        <w:numPr>
-          <w:ilvl w:val="0"/>
-          <w:numId w:val="2"/>
-        </w:numPr>
-        <w:bidi/>
-        <w:rPr>
-          <w:rFonts w:cs="Arial"/>
-          <w:sz w:val="22"/>
-          <w:szCs w:val="22"/>
-          <w:highlight w:val="green"/>
-          <w:rtl/>
-          <w:lang w:bidi="ar-EG"/>
-        </w:rPr>
-      </w:pPr>
-      <w:r>
-        <w:rPr>
-          <w:rFonts w:cs="Arial" w:hint="cs"/>
-          <w:sz w:val="22"/>
-          <w:szCs w:val="22"/>
-          <w:highlight w:val="green"/>
-          <w:rtl/>
-          <w:lang w:bidi="ar-EG"/>
-        </w:rPr>
-        <w:t>زر اكتب رسال</w:t>
-      </w:r>
-      <w:r>
-        <w:rPr>
-          <w:rFonts w:cs="Arial" w:hint="cs"/>
-          <w:sz w:val="22"/>
-          <w:szCs w:val="22"/>
-          <w:highlight w:val="green"/>
-          <w:rtl/>
-          <w:lang w:bidi="ar-EG"/>
-        </w:rPr>
-        <w:t>ة</w:t>
-      </w:r>
-      <w:r>
-        <w:rPr>
-          <w:rFonts w:cs="Arial" w:hint="cs"/>
-          <w:sz w:val="22"/>
-          <w:szCs w:val="22"/>
-          <w:highlight w:val="green"/>
-          <w:rtl/>
-          <w:lang w:bidi="ar-EG"/>
-        </w:rPr>
-        <w:t xml:space="preserve"> لا يجب ان يظهر الا بين العميل وال </w:t>
-      </w:r>
-      <w:r>
-        <w:rPr>
-          <w:rFonts w:cs="Arial"/>
-          <w:sz w:val="22"/>
-          <w:szCs w:val="22"/>
-          <w:highlight w:val="green"/>
-          <w:lang w:bidi="ar-EG"/>
-        </w:rPr>
-        <w:t xml:space="preserve">bidder </w:t>
-      </w:r>
-      <w:r>
-        <w:rPr>
-          <w:rFonts w:cs="Arial" w:hint="cs"/>
-          <w:sz w:val="22"/>
-          <w:szCs w:val="22"/>
-          <w:highlight w:val="green"/>
-          <w:rtl/>
-          <w:lang w:bidi="ar-EG"/>
-        </w:rPr>
-        <w:t xml:space="preserve">اللي على المهمة لكن بين </w:t>
-      </w:r>
-      <w:r>
-        <w:rPr>
-          <w:rFonts w:cs="Arial"/>
-          <w:sz w:val="22"/>
-          <w:szCs w:val="22"/>
-          <w:highlight w:val="green"/>
-          <w:lang w:bidi="ar-EG"/>
-        </w:rPr>
-        <w:t xml:space="preserve">freelancer </w:t>
-      </w:r>
-      <w:r>
-        <w:rPr>
-          <w:rFonts w:cs="Arial" w:hint="cs"/>
-          <w:sz w:val="22"/>
-          <w:szCs w:val="22"/>
-          <w:highlight w:val="green"/>
-          <w:rtl/>
-          <w:lang w:bidi="ar-EG"/>
-        </w:rPr>
-        <w:t>والاخر لا يجب ان يظهر</w:t>
-      </w:r>
-    </w:p>
-    <w:p>
-      <w:pPr>
-        <w:pStyle w:val="ListParagraph"/>
-        <w:numPr>
-          <w:ilvl w:val="0"/>
-          <w:numId w:val="2"/>
-        </w:numPr>
-        <w:bidi/>
-        <w:rPr>
-          <w:rFonts w:cs="Arial"/>
-          <w:sz w:val="22"/>
-          <w:szCs w:val="22"/>
-          <w:highlight w:val="green"/>
-          <w:rtl/>
-          <w:lang w:bidi="ar-EG"/>
-        </w:rPr>
-      </w:pPr>
-      <w:r>
-        <w:rPr>
-          <w:rFonts w:cs="Arial" w:hint="cs"/>
-          <w:sz w:val="22"/>
-          <w:szCs w:val="22"/>
-          <w:highlight w:val="green"/>
-          <w:rtl/>
-          <w:lang w:bidi="ar-EG"/>
-        </w:rPr>
-        <w:t xml:space="preserve">اول ما الادمن بيسجل دخول بيدخل على داشبورد ولوحة تحكم مهامي انا عايزاه يروح على الادمن بانل على طول </w:t>
-      </w:r>
-      <w:r>
-        <w:rPr>
-          <w:rFonts w:cs="Arial"/>
-          <w:sz w:val="22"/>
-          <w:szCs w:val="22"/>
-          <w:highlight w:val="green"/>
-          <w:lang w:bidi="ar-EG"/>
-        </w:rPr>
-        <w:t>admin/dashboard</w:t>
-      </w:r>
-    </w:p>
-    <w:p>
-      <w:pPr>
-        <w:pStyle w:val="ListParagraph"/>
-        <w:numPr>
-          <w:ilvl w:val="0"/>
-          <w:numId w:val="2"/>
-        </w:numPr>
-        <w:bidi/>
-        <w:rPr>
-          <w:rFonts w:cs="Arial"/>
-          <w:sz w:val="22"/>
-          <w:szCs w:val="22"/>
-          <w:highlight w:val="green"/>
-          <w:rtl/>
-          <w:lang w:bidi="ar-EG"/>
-        </w:rPr>
-      </w:pPr>
-      <w:r>
-        <w:rPr>
-          <w:rFonts w:cs="Arial" w:hint="cs"/>
-          <w:sz w:val="22"/>
-          <w:szCs w:val="22"/>
-          <w:highlight w:val="green"/>
-          <w:rtl/>
-          <w:lang w:bidi="ar-EG"/>
-        </w:rPr>
-        <w:t>الناف بار بتاعت الابليكيشن مش عايزاها تظهر للادمن خالص</w:t>
-      </w:r>
-    </w:p>
-    <w:p>
-      <w:pPr>
-        <w:pStyle w:val="ListParagraph"/>
-        <w:numPr>
-          <w:ilvl w:val="0"/>
-          <w:numId w:val="2"/>
-        </w:numPr>
-        <w:bidi/>
-        <w:rPr>
-          <w:rFonts w:cs="Arial"/>
-          <w:sz w:val="22"/>
-          <w:szCs w:val="22"/>
-          <w:highlight w:val="green"/>
-          <w:rtl/>
-          <w:lang w:bidi="ar-EG"/>
-        </w:rPr>
-      </w:pPr>
-      <w:r>
-        <w:rPr>
-          <w:rFonts w:cs="Arial" w:hint="cs"/>
-          <w:sz w:val="22"/>
-          <w:szCs w:val="22"/>
-          <w:highlight w:val="green"/>
-          <w:rtl/>
-          <w:lang w:bidi="ar-EG"/>
-        </w:rPr>
-        <w:t xml:space="preserve">يوجد مشكلة اخرى وهي تاريخ ال </w:t>
-      </w:r>
-      <w:r>
-        <w:rPr>
-          <w:rFonts w:cs="Arial"/>
-          <w:sz w:val="22"/>
-          <w:szCs w:val="22"/>
-          <w:highlight w:val="green"/>
-          <w:lang w:bidi="ar-EG"/>
-        </w:rPr>
-        <w:t xml:space="preserve">bidding </w:t>
-      </w:r>
-      <w:r>
-        <w:rPr>
-          <w:rFonts w:cs="Arial" w:hint="cs"/>
-          <w:sz w:val="22"/>
-          <w:szCs w:val="22"/>
-          <w:highlight w:val="green"/>
-          <w:rtl/>
-          <w:lang w:bidi="ar-EG"/>
-        </w:rPr>
-        <w:t xml:space="preserve"> اول ما </w:t>
-      </w:r>
-      <w:r>
-        <w:rPr>
-          <w:rFonts w:cs="Arial"/>
-          <w:sz w:val="22"/>
-          <w:szCs w:val="22"/>
-          <w:highlight w:val="green"/>
-          <w:lang w:bidi="ar-EG"/>
-        </w:rPr>
-        <w:t xml:space="preserve">bidder </w:t>
-      </w:r>
-      <w:r>
-        <w:rPr>
-          <w:rFonts w:cs="Arial" w:hint="cs"/>
-          <w:sz w:val="22"/>
-          <w:szCs w:val="22"/>
-          <w:highlight w:val="green"/>
-          <w:rtl/>
-          <w:lang w:bidi="ar-EG"/>
-        </w:rPr>
-        <w:t xml:space="preserve"> يضيف مزايدة يصبح تاريخ ال</w:t>
-      </w:r>
-      <w:r>
-        <w:rPr>
-          <w:rFonts w:cs="Arial"/>
-          <w:sz w:val="22"/>
-          <w:szCs w:val="22"/>
-          <w:highlight w:val="green"/>
-          <w:lang w:bidi="ar-EG"/>
-        </w:rPr>
-        <w:t xml:space="preserve">bidding </w:t>
-      </w:r>
-      <w:r>
-        <w:rPr>
-          <w:rFonts w:cs="Arial" w:hint="cs"/>
-          <w:sz w:val="22"/>
-          <w:szCs w:val="22"/>
-          <w:highlight w:val="green"/>
-          <w:rtl/>
-          <w:lang w:bidi="ar-EG"/>
-        </w:rPr>
-        <w:t>الاحدث هوالاقدم بمقدار يوم والمزايدة الاقدم هي الاحدث بمقدار يوم ايضا</w:t>
-      </w:r>
-    </w:p>
-    <w:p>
-      <w:pPr>
-        <w:pStyle w:val="ListParagraph"/>
-        <w:numPr>
-          <w:ilvl w:val="0"/>
-          <w:numId w:val="2"/>
-        </w:numPr>
-        <w:bidi/>
-        <w:rPr>
-          <w:rFonts w:cs="Arial"/>
-          <w:sz w:val="22"/>
-          <w:szCs w:val="22"/>
-          <w:highlight w:val="green"/>
-          <w:rtl/>
-          <w:lang w:bidi="ar-EG"/>
-        </w:rPr>
-      </w:pPr>
-      <w:r>
-        <w:rPr>
-          <w:rFonts w:cs="Arial" w:hint="cs"/>
-          <w:sz w:val="22"/>
-          <w:szCs w:val="22"/>
-          <w:highlight w:val="green"/>
-          <w:rtl/>
-          <w:lang w:bidi="ar-EG"/>
-        </w:rPr>
-        <w:t xml:space="preserve">اريد اخفاء استمارة تقديم العرض للمزايد الذي قدم عرضا بالفعل </w:t>
-      </w:r>
-    </w:p>
-    <w:p>
-      <w:pPr>
-        <w:pStyle w:val="ListParagraph"/>
-        <w:numPr>
-          <w:ilvl w:val="0"/>
-          <w:numId w:val="2"/>
-        </w:numPr>
-        <w:bidi/>
-        <w:rPr>
-          <w:sz w:val="22"/>
-          <w:szCs w:val="22"/>
-          <w:highlight w:val="green"/>
-        </w:rPr>
-      </w:pPr>
-      <w:r>
-        <w:rPr>
-          <w:rFonts w:cs="Arial"/>
-          <w:sz w:val="22"/>
-          <w:szCs w:val="22"/>
-          <w:highlight w:val="green"/>
-          <w:rtl/>
-        </w:rPr>
-        <w:t>ازالة رمز التاسك من المهمة</w:t>
-      </w:r>
-      <w:r>
-        <w:rPr>
-          <w:rFonts w:cs="Arial" w:hint="cs"/>
-          <w:sz w:val="22"/>
-          <w:szCs w:val="22"/>
-          <w:highlight w:val="green"/>
-          <w:rtl/>
-        </w:rPr>
-        <w:t xml:space="preserve">  في الكارد في الفرونت</w:t>
-      </w:r>
-    </w:p>
-    <w:p>
-      <w:pPr>
-        <w:pStyle w:val="ListParagraph"/>
-        <w:numPr>
-          <w:ilvl w:val="0"/>
-          <w:numId w:val="2"/>
-        </w:numPr>
-        <w:bidi/>
-        <w:rPr>
-          <w:sz w:val="22"/>
-          <w:szCs w:val="22"/>
-          <w:highlight w:val="green"/>
-        </w:rPr>
-      </w:pPr>
-      <w:r>
-        <w:rPr>
-          <w:rFonts w:cs="Arial" w:hint="cs"/>
-          <w:sz w:val="22"/>
-          <w:szCs w:val="22"/>
-          <w:highlight w:val="green"/>
-          <w:rtl/>
-        </w:rPr>
-        <w:t xml:space="preserve"> </w:t>
-      </w:r>
-      <w:r>
-        <w:rPr>
-          <w:rFonts w:cs="Arial"/>
-          <w:sz w:val="22"/>
-          <w:szCs w:val="22"/>
-          <w:highlight w:val="green"/>
-          <w:rtl/>
-        </w:rPr>
-        <w:t>امكانية ارسال رسائل للمتقدمين لمناقشة تفاصيل العمل قبل البدء</w:t>
-      </w:r>
-    </w:p>
-    <w:p>
-      <w:pPr>
-        <w:pStyle w:val="ListParagraph"/>
-        <w:numPr>
-          <w:ilvl w:val="0"/>
-          <w:numId w:val="2"/>
-        </w:numPr>
-        <w:bidi/>
-        <w:rPr>
-          <w:rFonts w:cs="Arial"/>
-          <w:sz w:val="22"/>
-          <w:szCs w:val="22"/>
-          <w:highlight w:val="green"/>
-          <w:rtl/>
-          <w:lang w:bidi="ar-EG"/>
-        </w:rPr>
-      </w:pPr>
-      <w:r>
-        <w:rPr>
-          <w:rFonts w:cs="Arial" w:hint="cs"/>
-          <w:sz w:val="22"/>
-          <w:szCs w:val="22"/>
-          <w:highlight w:val="green"/>
-          <w:rtl/>
-          <w:lang w:bidi="ar-EG"/>
-        </w:rPr>
-        <w:t xml:space="preserve">اريد تعديل جزء الرسائل بحيث يصبح ان عندما يضغط لعميل على زر مراسلة اللي جنب تعين المستقل يفتح نافذة بين العميل وهذا المستقل تمكن العميل من مراسلة المستقل واذا العميل لم يراسل اي رسالة للمستقل ل يجب ان تظهر المحادثة في ليست المحادثات الجانبي </w:t>
-      </w:r>
-    </w:p>
-    <w:p>
-      <w:pPr>
-        <w:pStyle w:val="ListParagraph"/>
-        <w:numPr>
-          <w:ilvl w:val="0"/>
-          <w:numId w:val="2"/>
-        </w:numPr>
-        <w:bidi/>
-        <w:rPr>
-          <w:rFonts w:cs="Arial"/>
-          <w:sz w:val="22"/>
-          <w:szCs w:val="22"/>
-          <w:highlight w:val="green"/>
-          <w:rtl/>
-          <w:lang w:bidi="ar-EG"/>
-        </w:rPr>
-      </w:pPr>
-      <w:r>
-        <w:rPr>
-          <w:rFonts w:cs="Arial" w:hint="cs"/>
-          <w:sz w:val="22"/>
-          <w:szCs w:val="22"/>
-          <w:highlight w:val="green"/>
-          <w:rtl/>
-          <w:lang w:bidi="ar-EG"/>
-        </w:rPr>
-        <w:t xml:space="preserve">اواجه مشكلة ان عندما يرسل العميل رسالة الى </w:t>
-      </w:r>
-      <w:r>
-        <w:rPr>
-          <w:rFonts w:cs="Arial"/>
-          <w:sz w:val="22"/>
-          <w:szCs w:val="22"/>
-          <w:highlight w:val="green"/>
-          <w:lang w:bidi="ar-EG"/>
-        </w:rPr>
-        <w:t xml:space="preserve">bidder1 </w:t>
-      </w:r>
-      <w:r>
-        <w:rPr>
-          <w:rFonts w:cs="Arial" w:hint="cs"/>
-          <w:sz w:val="22"/>
-          <w:szCs w:val="22"/>
-          <w:highlight w:val="green"/>
-          <w:rtl/>
-          <w:lang w:bidi="ar-EG"/>
-        </w:rPr>
-        <w:t xml:space="preserve">مثلا يفضل يعمل لودينج وببقا مش عارفة الراسلة هتوصل امتى ولما بعمل تسجيل خروج وبرجع تاني ادخل الاقيها اتبعتت عادي طيب ليه مش بتظهر على طول او بتتبعت بسرعة </w:t>
-      </w:r>
-    </w:p>
-    <w:p>
-      <w:pPr>
-        <w:pStyle w:val="ListParagraph"/>
-        <w:numPr>
-          <w:ilvl w:val="0"/>
-          <w:numId w:val="2"/>
-        </w:numPr>
-        <w:bidi/>
-        <w:rPr>
-          <w:rFonts w:cs="Arial"/>
-          <w:sz w:val="22"/>
-          <w:szCs w:val="22"/>
-          <w:highlight w:val="green"/>
-          <w:lang w:bidi="ar-EG"/>
-        </w:rPr>
-      </w:pPr>
-      <w:r>
-        <w:rPr>
-          <w:rFonts w:cs="Arial" w:hint="cs"/>
-          <w:sz w:val="22"/>
-          <w:szCs w:val="22"/>
-          <w:highlight w:val="green"/>
-          <w:rtl/>
-          <w:lang w:bidi="ar-EG"/>
-        </w:rPr>
-        <w:t>الايرور دا بيظهرلي لما بفتح الاكونت بحساب المستقل في جزء الشات</w:t>
-      </w:r>
-    </w:p>
-    <w:p>
-      <w:pPr>
-        <w:pStyle w:val="ListParagraph"/>
+        <w:t>مفيش اشعار بيظهر للمستخدم عند توثيق هويته</w:t>
+      </w:r>
+    </w:p>
+    <w:p>
+      <w:pPr>
         <w:bidi/>
         <w:ind w:left="360"/>
         <w:rPr>
           <w:rFonts w:cs="Arial"/>
-          <w:sz w:val="22"/>
-          <w:szCs w:val="22"/>
-          <w:highlight w:val="green"/>
-          <w:lang w:bidi="ar-EG"/>
-        </w:rPr>
-      </w:pPr>
-      <w:r>
-        <w:rPr>
-          <w:rFonts w:cs="Arial" w:hint="cs"/>
-          <w:sz w:val="22"/>
-          <w:szCs w:val="22"/>
-          <w:highlight w:val="green"/>
-          <w:rtl/>
-          <w:lang w:bidi="ar-EG"/>
-        </w:rPr>
-        <w:t xml:space="preserve"> </w:t>
-      </w:r>
-      <w:r>
-        <w:rPr>
-          <w:rFonts w:cs="Arial"/>
-          <w:sz w:val="22"/>
-          <w:szCs w:val="22"/>
-          <w:highlight w:val="green"/>
-          <w:lang w:bidi="ar-EG"/>
-        </w:rPr>
-        <w:t>XHRGET</w:t>
-      </w:r>
-    </w:p>
-    <w:p>
-      <w:pPr>
-        <w:pStyle w:val="ListParagraph"/>
+          <w:highlight w:val="green"/>
+          <w:rtl/>
+          <w:lang w:bidi="ar-EG"/>
+        </w:rPr>
+      </w:pPr>
+    </w:p>
+    <w:p>
+      <w:pPr>
         <w:bidi/>
         <w:ind w:left="360"/>
         <w:rPr>
           <w:rFonts w:cs="Arial"/>
-          <w:sz w:val="22"/>
-          <w:szCs w:val="22"/>
-          <w:highlight w:val="green"/>
-          <w:lang w:bidi="ar-EG"/>
-        </w:rPr>
-      </w:pPr>
-      <w:r>
-        <w:rPr>
-          <w:rFonts w:cs="Arial"/>
-          <w:sz w:val="22"/>
-          <w:szCs w:val="22"/>
-          <w:highlight w:val="green"/>
-          <w:lang w:bidi="ar-EG"/>
-        </w:rPr>
-        <w:t>http://localhost:5294/api/chat/conversation/88c8aef3-131f-4cf2-aa60-aa0c26e73d97?page=1&amp;pageSize=50</w:t>
-      </w:r>
+          <w:highlight w:val="green"/>
+          <w:lang w:bidi="ar-EG"/>
+        </w:rPr>
+      </w:pPr>
     </w:p>
     <w:p>
       <w:pPr>
@@ -1541,216 +1836,50 @@
         <w:ind w:left="900"/>
         <w:rPr>
           <w:rFonts w:cs="Arial"/>
-          <w:sz w:val="22"/>
-          <w:szCs w:val="22"/>
-          <w:highlight w:val="green"/>
-          <w:lang w:bidi="ar-EG"/>
-        </w:rPr>
-      </w:pPr>
-      <w:r>
-        <w:rPr>
-          <w:rFonts w:cs="Arial"/>
-          <w:sz w:val="22"/>
-          <w:szCs w:val="22"/>
-          <w:highlight w:val="green"/>
-          <w:rtl/>
-          <w:lang w:bidi="ar-EG"/>
-        </w:rPr>
-        <w:t>[</w:t>
-      </w:r>
-      <w:r>
-        <w:rPr>
-          <w:rFonts w:cs="Arial"/>
-          <w:sz w:val="22"/>
-          <w:szCs w:val="22"/>
-          <w:highlight w:val="green"/>
-          <w:lang w:bidi="ar-EG"/>
-        </w:rPr>
-        <w:t>HTTP/1.1 403 Forbidden 1632ms</w:t>
-      </w:r>
-      <w:r>
-        <w:rPr>
-          <w:rFonts w:cs="Arial"/>
-          <w:sz w:val="22"/>
-          <w:szCs w:val="22"/>
-          <w:highlight w:val="green"/>
-          <w:rtl/>
-          <w:lang w:bidi="ar-EG"/>
-        </w:rPr>
-        <w:t>]</w:t>
-      </w:r>
-    </w:p>
-    <w:p>
-      <w:pPr>
-        <w:pStyle w:val="ListParagraph"/>
-        <w:bidi/>
-        <w:ind w:left="900"/>
-        <w:rPr>
-          <w:rFonts w:cs="Arial"/>
-          <w:sz w:val="22"/>
-          <w:szCs w:val="22"/>
-          <w:rtl/>
-          <w:lang w:bidi="ar-EG"/>
-        </w:rPr>
-      </w:pPr>
-      <w:r>
-        <w:rPr>
-          <w:rFonts w:cs="Arial" w:hint="cs"/>
-          <w:sz w:val="22"/>
-          <w:szCs w:val="22"/>
-          <w:highlight w:val="green"/>
-          <w:rtl/>
-          <w:lang w:bidi="ar-EG"/>
-        </w:rPr>
-        <w:t>ولا يتم تحميل الرسائل</w:t>
-      </w:r>
-    </w:p>
-    <w:p>
-      <w:pPr>
-        <w:pStyle w:val="ListParagraph"/>
-        <w:numPr>
-          <w:ilvl w:val="0"/>
-          <w:numId w:val="2"/>
-        </w:numPr>
-        <w:bidi/>
-        <w:rPr>
-          <w:rFonts w:cs="Arial"/>
-          <w:sz w:val="22"/>
-          <w:szCs w:val="22"/>
-          <w:highlight w:val="green"/>
-          <w:rtl/>
-          <w:lang w:bidi="ar-EG"/>
-        </w:rPr>
-      </w:pPr>
-      <w:r>
-        <w:rPr>
-          <w:rFonts w:cs="Arial" w:hint="cs"/>
-          <w:sz w:val="22"/>
-          <w:szCs w:val="22"/>
-          <w:highlight w:val="green"/>
-          <w:rtl/>
-          <w:lang w:bidi="ar-EG"/>
-        </w:rPr>
-        <w:t xml:space="preserve">الكارثة بقا ان المحادثة اللي بين </w:t>
-      </w:r>
-      <w:r>
-        <w:rPr>
-          <w:rFonts w:cs="Arial"/>
-          <w:sz w:val="22"/>
-          <w:szCs w:val="22"/>
-          <w:highlight w:val="green"/>
-          <w:lang w:bidi="ar-EG"/>
-        </w:rPr>
-        <w:t xml:space="preserve">bidder1 </w:t>
-      </w:r>
-      <w:r>
-        <w:rPr>
-          <w:rFonts w:cs="Arial" w:hint="cs"/>
-          <w:sz w:val="22"/>
-          <w:szCs w:val="22"/>
-          <w:highlight w:val="green"/>
-          <w:rtl/>
-          <w:lang w:bidi="ar-EG"/>
-        </w:rPr>
-        <w:t xml:space="preserve">والعميل هي هي المحادثة اللي بين </w:t>
-      </w:r>
-      <w:r>
-        <w:rPr>
-          <w:rFonts w:cs="Arial"/>
-          <w:sz w:val="22"/>
-          <w:szCs w:val="22"/>
-          <w:highlight w:val="green"/>
-          <w:lang w:bidi="ar-EG"/>
-        </w:rPr>
-        <w:t xml:space="preserve">bidder2 </w:t>
-      </w:r>
-      <w:r>
-        <w:rPr>
-          <w:rFonts w:cs="Arial" w:hint="cs"/>
-          <w:sz w:val="22"/>
-          <w:szCs w:val="22"/>
-          <w:highlight w:val="green"/>
-          <w:rtl/>
-          <w:lang w:bidi="ar-EG"/>
-        </w:rPr>
-        <w:t xml:space="preserve">والعميل نفس الرسايل بتبقا ظاهرة للكل </w:t>
-      </w:r>
-    </w:p>
-    <w:p>
-      <w:pPr>
-        <w:pStyle w:val="ListParagraph"/>
-        <w:numPr>
-          <w:ilvl w:val="0"/>
-          <w:numId w:val="2"/>
-        </w:numPr>
-        <w:bidi/>
-        <w:rPr>
-          <w:rFonts w:cs="Arial"/>
-          <w:highlight w:val="green"/>
-          <w:rtl/>
-          <w:lang w:bidi="ar-EG"/>
-        </w:rPr>
-      </w:pPr>
-      <w:r>
-        <w:rPr>
-          <w:rFonts w:cs="Arial" w:hint="cs"/>
-          <w:highlight w:val="green"/>
-          <w:rtl/>
-          <w:lang w:bidi="ar-EG"/>
-        </w:rPr>
-        <w:t>اظهار الوثائق المرفوعة في جزء التحقق من الهوية للأدمن فيمكنه فتحها والاطلاع عليها سواء كانت صور او مستندات</w:t>
-      </w:r>
-    </w:p>
-    <w:p>
-      <w:pPr>
-        <w:pStyle w:val="ListParagraph"/>
-        <w:bidi/>
-        <w:ind w:left="900"/>
-        <w:rPr>
-          <w:rFonts w:cs="Arial"/>
-          <w:rtl/>
-          <w:lang w:bidi="ar-EG"/>
-        </w:rPr>
-      </w:pPr>
-    </w:p>
-    <w:p>
-      <w:pPr>
-        <w:pStyle w:val="ListParagraph"/>
-        <w:bidi/>
-        <w:rPr>
-          <w:rFonts w:cs="Arial"/>
-          <w:rtl/>
-          <w:lang w:bidi="ar-EG"/>
-        </w:rPr>
-      </w:pPr>
-    </w:p>
-    <w:p>
-      <w:pPr>
-        <w:pStyle w:val="ListParagraph"/>
-        <w:bidi/>
-        <w:rPr>
-          <w:rFonts w:cs="Arial"/>
-          <w:rtl/>
-          <w:lang w:bidi="ar-EG"/>
-        </w:rPr>
-      </w:pPr>
-    </w:p>
-    <w:p>
-      <w:pPr>
-        <w:pStyle w:val="ListParagraph"/>
-        <w:bidi/>
-        <w:rPr>
-          <w:rFonts w:cs="Arial"/>
-          <w:rtl/>
-          <w:lang w:bidi="ar-EG"/>
-        </w:rPr>
-      </w:pPr>
-      <w:r>
-        <w:rPr>
-          <w:rFonts w:cs="Arial" w:hint="cs"/>
-          <w:rtl/>
-          <w:lang w:bidi="ar-EG"/>
-        </w:rPr>
+          <w:rtl/>
+          <w:lang w:bidi="ar-EG"/>
+        </w:rPr>
+      </w:pPr>
+    </w:p>
+    <w:p>
+      <w:pPr>
+        <w:pStyle w:val="ListParagraph"/>
+        <w:bidi/>
+        <w:rPr>
+          <w:rFonts w:cs="Arial"/>
+          <w:rtl/>
+          <w:lang w:bidi="ar-EG"/>
+        </w:rPr>
+      </w:pPr>
+    </w:p>
+    <w:p>
+      <w:pPr>
+        <w:pStyle w:val="ListParagraph"/>
+        <w:bidi/>
+        <w:rPr>
+          <w:rFonts w:cs="Arial"/>
+          <w:rtl/>
+          <w:lang w:bidi="ar-EG"/>
+        </w:rPr>
+      </w:pPr>
+    </w:p>
+    <w:p>
+      <w:pPr>
+        <w:pStyle w:val="ListParagraph"/>
+        <w:bidi/>
+        <w:rPr>
+          <w:rFonts w:cs="Arial"/>
+          <w:rtl/>
+          <w:lang w:bidi="ar-EG"/>
+        </w:rPr>
+      </w:pPr>
+      <w:r>
+        <w:rPr>
+          <w:rFonts w:cs="Arial" w:hint="cs"/>
+          <w:rtl/>
+          <w:lang w:bidi="ar-EG"/>
+        </w:rPr>
+        <w:lastRenderedPageBreak/>
         <w:t>دلوقتي</w:t>
       </w:r>
     </w:p>
@@ -1764,74 +1893,6 @@
         <w:bidi/>
         <w:rPr>
           <w:rFonts w:cs="Arial"/>
-          <w:highlight w:val="red"/>
-          <w:rtl/>
-          <w:lang w:bidi="ar-EG"/>
-        </w:rPr>
-      </w:pPr>
-      <w:r>
-        <w:rPr>
-          <w:rFonts w:cs="Arial" w:hint="cs"/>
-          <w:highlight w:val="red"/>
-          <w:rtl/>
-          <w:lang w:bidi="ar-EG"/>
-        </w:rPr>
-        <w:t>عند رفع الوثيقة يجب ان تظهر</w:t>
-      </w:r>
-      <w:r>
-        <w:rPr>
-          <w:rFonts w:cs="Arial" w:hint="cs"/>
-          <w:highlight w:val="red"/>
-          <w:rtl/>
-          <w:lang w:bidi="ar-EG"/>
-        </w:rPr>
-        <w:t xml:space="preserve"> للمستخدم ك </w:t>
-      </w:r>
-      <w:r>
-        <w:rPr>
-          <w:rFonts w:cs="Arial"/>
-          <w:highlight w:val="red"/>
-          <w:lang w:bidi="ar-EG"/>
-        </w:rPr>
-        <w:t>preview</w:t>
-      </w:r>
-      <w:r>
-        <w:rPr>
-          <w:rFonts w:cs="Arial" w:hint="cs"/>
-          <w:highlight w:val="red"/>
-          <w:rtl/>
-          <w:lang w:bidi="ar-EG"/>
-        </w:rPr>
-        <w:t xml:space="preserve"> لو كانت صورة او </w:t>
-      </w:r>
-      <w:r>
-        <w:rPr>
-          <w:rFonts w:cs="Arial"/>
-          <w:highlight w:val="red"/>
-          <w:lang w:bidi="ar-EG"/>
-        </w:rPr>
-        <w:t xml:space="preserve">pdf </w:t>
-      </w:r>
-      <w:r>
-        <w:rPr>
-          <w:rFonts w:cs="Arial" w:hint="cs"/>
-          <w:highlight w:val="red"/>
-          <w:rtl/>
-          <w:lang w:bidi="ar-EG"/>
-        </w:rPr>
-        <w:t xml:space="preserve"> حتى يطمئئن المستخدم انه اختار صح مش بس اسم.امتداد</w:t>
-      </w:r>
-    </w:p>
-    <w:p>
-      <w:pPr>
-        <w:pStyle w:val="ListParagraph"/>
-        <w:numPr>
-          <w:ilvl w:val="0"/>
-          <w:numId w:val="5"/>
-        </w:numPr>
-        <w:bidi/>
-        <w:rPr>
-          <w:rFonts w:cs="Arial"/>
           <w:highlight w:val="yellow"/>
           <w:rtl/>
           <w:lang w:bidi="ar-EG"/>
@@ -1895,125 +1956,22 @@
     </w:p>
     <w:p>
       <w:pPr>
-        <w:pStyle w:val="ListParagraph"/>
-        <w:numPr>
-          <w:ilvl w:val="0"/>
-          <w:numId w:val="5"/>
-        </w:numPr>
-        <w:bidi/>
-        <w:rPr>
-          <w:rFonts w:cs="Arial"/>
-          <w:rtl/>
-          <w:lang w:bidi="ar-EG"/>
-        </w:rPr>
-      </w:pPr>
-      <w:r>
-        <w:rPr>
-          <w:rFonts w:cs="Arial" w:hint="cs"/>
-          <w:rtl/>
-          <w:lang w:bidi="ar-EG"/>
-        </w:rPr>
-        <w:t xml:space="preserve">مفيش اشعار بيظهر </w:t>
-      </w:r>
-      <w:r>
-        <w:rPr>
-          <w:rFonts w:cs="Arial" w:hint="cs"/>
-          <w:rtl/>
-          <w:lang w:bidi="ar-EG"/>
-        </w:rPr>
-        <w:t>للمستخدم</w:t>
-      </w:r>
-      <w:r>
-        <w:rPr>
-          <w:rFonts w:cs="Arial" w:hint="cs"/>
-          <w:rtl/>
-          <w:lang w:bidi="ar-EG"/>
-        </w:rPr>
-        <w:t xml:space="preserve"> </w:t>
-      </w:r>
-      <w:r>
-        <w:rPr>
-          <w:rFonts w:cs="Arial" w:hint="cs"/>
-          <w:rtl/>
-          <w:lang w:bidi="ar-EG"/>
-        </w:rPr>
-        <w:t>عند توثيق هويته</w:t>
-      </w:r>
-    </w:p>
-    <w:p>
-      <w:pPr>
-        <w:bidi/>
-        <w:rPr>
-          <w:rFonts w:cs="Arial"/>
-          <w:lang w:bidi="ar-EG"/>
-        </w:rPr>
-      </w:pPr>
-    </w:p>
-    <w:p>
-      <w:pPr>
-        <w:bidi/>
-        <w:rPr>
-          <w:rFonts w:cs="Arial"/>
-          <w:rtl/>
-          <w:lang w:bidi="ar-EG"/>
-        </w:rPr>
-      </w:pPr>
-      <w:r>
-        <w:rPr>
-          <w:rFonts w:cs="Arial" w:hint="cs"/>
-          <w:noProof/>
-          <w:highlight w:val="yellow"/>
-          <w:lang w:bidi="ar-EG"/>
-        </w:rPr>
-        <w:drawing>
-          <wp:inline distT="0" distB="0" distL="0" distR="0" wp14:anchorId="0502B13D" wp14:editId="53562708">
-            <wp:extent cx="5936615" cy="3338830"/>
-            <wp:effectExtent l="0" t="0" r="6985" b="0"/>
-            <wp:docPr id="678514352" name="Picture 2"/>
-            <wp:cNvGraphicFramePr>
-              <a:graphicFrameLocks xmlns:a="http://schemas.openxmlformats.org/drawingml/2006/main" noChangeAspect="1"/>
-            </wp:cNvGraphicFramePr>
-            <a:graphic xmlns:a="http://schemas.openxmlformats.org/drawingml/2006/main">
-              <a:graphicData uri="http://schemas.openxmlformats.org/drawingml/2006/picture">
-                <pic:pic xmlns:pic="http://schemas.openxmlformats.org/drawingml/2006/picture">
-                  <pic:nvPicPr>
-                    <pic:cNvPr id="0" name="Picture 2"/>
-                    <pic:cNvPicPr>
-                      <a:picLocks noChangeAspect="1" noChangeArrowheads="1"/>
-                    </pic:cNvPicPr>
-                  </pic:nvPicPr>
-                  <pic:blipFill>
-                    <a:blip r:embed="rId5">
-                      <a:extLst>
-                        <a:ext uri="{28A0092B-C50C-407E-A947-70E740481C1C}">
-                          <a14:useLocalDpi xmlns:a14="http://schemas.microsoft.com/office/drawing/2010/main" val="0"/>
-                        </a:ext>
-                      </a:extLst>
-                    </a:blip>
-                    <a:srcRect/>
-                    <a:stretch>
-                      <a:fillRect/>
-                    </a:stretch>
-                  </pic:blipFill>
-                  <pic:spPr bwMode="auto">
-                    <a:xfrm>
-                      <a:off x="0" y="0"/>
-                      <a:ext cx="5936615" cy="3338830"/>
-                    </a:xfrm>
-                    <a:prstGeom prst="rect">
-                      <a:avLst/>
-                    </a:prstGeom>
-                    <a:noFill/>
-                    <a:ln>
-                      <a:noFill/>
-                    </a:ln>
-                  </pic:spPr>
-                </pic:pic>
-              </a:graphicData>
-            </a:graphic>
-          </wp:inline>
-        </w:drawing>
-      </w:r>
+        <w:bidi/>
+        <w:rPr>
+          <w:rFonts w:cs="Arial"/>
+          <w:lang w:bidi="ar-EG"/>
+        </w:rPr>
+      </w:pPr>
+    </w:p>
+    <w:p>
+      <w:pPr>
+        <w:bidi/>
+        <w:rPr>
+          <w:rFonts w:cs="Arial"/>
+          <w:rtl/>
+          <w:lang w:bidi="ar-EG"/>
+        </w:rPr>
+      </w:pPr>
     </w:p>
     <w:p>
       <w:pPr>
@@ -2172,7 +2130,6 @@
         <w:rPr>
           <w:lang w:bidi="ar-EG"/>
         </w:rPr>
-        <w:lastRenderedPageBreak/>
         <w:t>&lt;!--</w:t>
       </w:r>
       <w:proofErr w:type="gramEnd"/>

</xml_diff>

<commit_message>
Update مهام.docx with new content
The binary file `مهام.docx` has been modified. Due to its binary nature, the exact changes cannot be displayed in the diff, but the file's contents have been updated.
</commit_message>
<xml_diff>
--- a/مهام.docx
+++ b/مهام.docx
@@ -16,20 +16,28 @@
           <w:numId w:val="3"/>
         </w:numPr>
         <w:bidi/>
+        <w:rPr>
+          <w:highlight w:val="green"/>
+        </w:rPr>
       </w:pPr>
       <w:r>
         <w:rPr>
           <w:rFonts w:hint="cs"/>
+          <w:highlight w:val="green"/>
           <w:rtl/>
         </w:rPr>
         <w:t xml:space="preserve">تغيير ال </w:t>
       </w:r>
       <w:r>
+        <w:rPr>
+          <w:highlight w:val="green"/>
+        </w:rPr>
         <w:t>confirm</w:t>
       </w:r>
       <w:r>
         <w:rPr>
           <w:rFonts w:hint="cs"/>
+          <w:highlight w:val="green"/>
           <w:rtl/>
           <w:lang w:bidi="ar-EG"/>
         </w:rPr>
@@ -37,6 +45,7 @@
       </w:r>
       <w:r>
         <w:rPr>
+          <w:highlight w:val="green"/>
           <w:lang w:bidi="ar-EG"/>
         </w:rPr>
         <w:t>award</w:t>
@@ -44,6 +53,7 @@
       <w:r>
         <w:rPr>
           <w:rFonts w:hint="cs"/>
+          <w:highlight w:val="green"/>
           <w:rtl/>
           <w:lang w:bidi="ar-EG"/>
         </w:rPr>
@@ -51,6 +61,7 @@
       </w:r>
       <w:r>
         <w:rPr>
+          <w:highlight w:val="green"/>
           <w:lang w:bidi="ar-EG"/>
         </w:rPr>
         <w:t xml:space="preserve">modal </w:t>
@@ -58,6 +69,7 @@
       <w:r>
         <w:rPr>
           <w:rFonts w:hint="cs"/>
+          <w:highlight w:val="green"/>
           <w:rtl/>
           <w:lang w:bidi="ar-EG"/>
         </w:rPr>
@@ -65,6 +77,7 @@
       </w:r>
       <w:r>
         <w:rPr>
+          <w:highlight w:val="green"/>
           <w:lang w:bidi="ar-EG"/>
         </w:rPr>
         <w:t xml:space="preserve">reusable </w:t>
@@ -72,6 +85,7 @@
       <w:r>
         <w:rPr>
           <w:rFonts w:hint="cs"/>
+          <w:highlight w:val="green"/>
           <w:rtl/>
           <w:lang w:bidi="ar-EG"/>
         </w:rPr>
@@ -86,13 +100,20 @@
           <w:numId w:val="3"/>
         </w:numPr>
         <w:bidi/>
-      </w:pPr>
-      <w:r>
+        <w:rPr>
+          <w:highlight w:val="green"/>
+        </w:rPr>
+      </w:pPr>
+      <w:r>
+        <w:rPr>
+          <w:highlight w:val="green"/>
+        </w:rPr>
         <w:t xml:space="preserve">Load </w:t>
       </w:r>
       <w:r>
         <w:rPr>
           <w:rFonts w:hint="cs"/>
+          <w:highlight w:val="green"/>
           <w:rtl/>
           <w:lang w:bidi="ar-EG"/>
         </w:rPr>
@@ -100,6 +121,7 @@
       </w:r>
       <w:r>
         <w:rPr>
+          <w:highlight w:val="green"/>
           <w:lang w:bidi="ar-EG"/>
         </w:rPr>
         <w:t xml:space="preserve">award </w:t>
@@ -107,6 +129,7 @@
       <w:r>
         <w:rPr>
           <w:rFonts w:hint="cs"/>
+          <w:highlight w:val="green"/>
           <w:rtl/>
           <w:lang w:bidi="ar-EG"/>
         </w:rPr>
@@ -114,6 +137,7 @@
       </w:r>
       <w:r>
         <w:rPr>
+          <w:highlight w:val="green"/>
           <w:lang w:bidi="ar-EG"/>
         </w:rPr>
         <w:t xml:space="preserve">success toast </w:t>
@@ -121,6 +145,7 @@
       <w:r>
         <w:rPr>
           <w:rFonts w:hint="cs"/>
+          <w:highlight w:val="green"/>
           <w:rtl/>
           <w:lang w:bidi="ar-EG"/>
         </w:rPr>
@@ -135,20 +160,28 @@
           <w:numId w:val="3"/>
         </w:numPr>
         <w:bidi/>
+        <w:rPr>
+          <w:highlight w:val="green"/>
+        </w:rPr>
       </w:pPr>
       <w:r>
         <w:rPr>
           <w:rFonts w:hint="cs"/>
+          <w:highlight w:val="green"/>
           <w:rtl/>
         </w:rPr>
         <w:t xml:space="preserve">اول </w:t>
       </w:r>
       <w:r>
+        <w:rPr>
+          <w:highlight w:val="green"/>
+        </w:rPr>
         <w:t xml:space="preserve">login </w:t>
       </w:r>
       <w:r>
         <w:rPr>
           <w:rFonts w:hint="cs"/>
+          <w:highlight w:val="green"/>
           <w:rtl/>
         </w:rPr>
         <w:t xml:space="preserve"> </w:t>
@@ -156,6 +189,7 @@
       <w:r>
         <w:rPr>
           <w:rFonts w:hint="cs"/>
+          <w:highlight w:val="green"/>
           <w:rtl/>
           <w:lang w:bidi="ar-EG"/>
         </w:rPr>
@@ -163,6 +197,7 @@
       </w:r>
       <w:r>
         <w:rPr>
+          <w:highlight w:val="green"/>
           <w:lang w:bidi="ar-EG"/>
         </w:rPr>
         <w:t xml:space="preserve">load </w:t>
@@ -170,6 +205,7 @@
       <w:r>
         <w:rPr>
           <w:rFonts w:hint="cs"/>
+          <w:highlight w:val="green"/>
           <w:rtl/>
           <w:lang w:bidi="ar-EG"/>
         </w:rPr>
@@ -184,13 +220,34 @@
           <w:numId w:val="3"/>
         </w:numPr>
         <w:bidi/>
+        <w:rPr>
+          <w:highlight w:val="green"/>
+        </w:rPr>
       </w:pPr>
       <w:r>
         <w:rPr>
           <w:rFonts w:hint="cs"/>
-          <w:rtl/>
-        </w:rPr>
-        <w:t>المستق لا يرى عرضه، عايزة المستقل يشوف عرضه عادي</w:t>
+          <w:highlight w:val="green"/>
+          <w:rtl/>
+        </w:rPr>
+        <w:t>المستق</w:t>
+      </w:r>
+      <w:r>
+        <w:rPr>
+          <w:rFonts w:hint="cs"/>
+          <w:highlight w:val="green"/>
+          <w:rtl/>
+          <w:lang w:bidi="ar-EG"/>
+        </w:rPr>
+        <w:t>ل</w:t>
+      </w:r>
+      <w:r>
+        <w:rPr>
+          <w:rFonts w:hint="cs"/>
+          <w:highlight w:val="green"/>
+          <w:rtl/>
+        </w:rPr>
+        <w:t xml:space="preserve"> لا يرى عرضه، عايزة المستقل يشوف عرضه عادي</w:t>
       </w:r>
     </w:p>
     <w:p>
@@ -201,19 +258,27 @@
           <w:numId w:val="3"/>
         </w:numPr>
         <w:bidi/>
+        <w:rPr>
+          <w:highlight w:val="green"/>
+        </w:rPr>
       </w:pPr>
       <w:r>
         <w:rPr>
           <w:rFonts w:hint="cs"/>
+          <w:highlight w:val="green"/>
           <w:rtl/>
         </w:rPr>
         <w:t>الرسائل ال</w:t>
       </w:r>
       <w:r>
+        <w:rPr>
+          <w:highlight w:val="green"/>
+        </w:rPr>
         <w:t xml:space="preserve">msg </w:t>
       </w:r>
       <w:r>
         <w:rPr>
+          <w:highlight w:val="green"/>
           <w:lang w:bidi="ar-EG"/>
         </w:rPr>
         <w:t xml:space="preserve">blocked </w:t>
@@ -221,6 +286,7 @@
       <w:r>
         <w:rPr>
           <w:rFonts w:hint="cs"/>
+          <w:highlight w:val="green"/>
           <w:rtl/>
           <w:lang w:bidi="ar-EG"/>
         </w:rPr>
@@ -235,20 +301,28 @@
           <w:numId w:val="3"/>
         </w:numPr>
         <w:bidi/>
+        <w:rPr>
+          <w:highlight w:val="green"/>
+        </w:rPr>
       </w:pPr>
       <w:r>
         <w:rPr>
           <w:rFonts w:hint="cs"/>
+          <w:highlight w:val="green"/>
           <w:rtl/>
         </w:rPr>
         <w:t xml:space="preserve">عايزة علامة لل </w:t>
       </w:r>
       <w:r>
+        <w:rPr>
+          <w:highlight w:val="green"/>
+        </w:rPr>
         <w:t xml:space="preserve">unread messages </w:t>
       </w:r>
       <w:r>
         <w:rPr>
           <w:rFonts w:hint="cs"/>
+          <w:highlight w:val="green"/>
           <w:rtl/>
           <w:lang w:bidi="ar-EG"/>
         </w:rPr>
@@ -263,10 +337,14 @@
           <w:numId w:val="3"/>
         </w:numPr>
         <w:bidi/>
+        <w:rPr>
+          <w:highlight w:val="green"/>
+        </w:rPr>
       </w:pPr>
       <w:r>
         <w:rPr>
           <w:rFonts w:hint="cs"/>
+          <w:highlight w:val="green"/>
           <w:rtl/>
         </w:rPr>
         <w:t>عندما يريد المستقل تسليم العمل تظهر تحت استمارة التسليم العروض المقدمة انا مش عايزاها تظهر عند تسليم العمل ولا حتى للعميل لما يبقا بيراجع العمل لانها بتظهرله بردو</w:t>
@@ -280,13 +358,43 @@
           <w:numId w:val="3"/>
         </w:numPr>
         <w:bidi/>
+        <w:rPr>
+          <w:highlight w:val="yellow"/>
+        </w:rPr>
       </w:pPr>
       <w:r>
         <w:rPr>
           <w:rFonts w:hint="cs"/>
-          <w:rtl/>
-        </w:rPr>
-        <w:t>عايزة الاشعارات تبقى موجهة مثلا طلب منك تعديل تذهب للصفحة التي تلائمها وهي صفحة تسليم العمل وهكذا كل الاشعارات</w:t>
+          <w:highlight w:val="yellow"/>
+          <w:rtl/>
+        </w:rPr>
+        <w:t>عايزة الاشعارات تبقى موجهة مثلا طلب منك تعديل تذهب للصفحة التي تلائمها وهي صفحة تسليم العمل وهكذا كل الاشعا</w:t>
+      </w:r>
+      <w:r>
+        <w:rPr>
+          <w:rFonts w:hint="cs"/>
+          <w:highlight w:val="yellow"/>
+          <w:rtl/>
+          <w:lang w:bidi="ar-EG"/>
+        </w:rPr>
+        <w:t xml:space="preserve">رات </w:t>
+      </w:r>
+      <w:r>
+        <w:rPr>
+          <w:highlight w:val="yellow"/>
+          <w:rtl/>
+          <w:lang w:bidi="ar-EG"/>
+        </w:rPr>
+        <w:t>–</w:t>
+      </w:r>
+      <w:r>
+        <w:rPr>
+          <w:rFonts w:hint="cs"/>
+          <w:highlight w:val="yellow"/>
+          <w:rtl/>
+          <w:lang w:bidi="ar-EG"/>
+        </w:rPr>
+        <w:t>تعمل فقط مع النزاع الى الان</w:t>
       </w:r>
     </w:p>
     <w:p>
@@ -324,20 +432,28 @@
           <w:numId w:val="3"/>
         </w:numPr>
         <w:bidi/>
+        <w:rPr>
+          <w:highlight w:val="green"/>
+        </w:rPr>
       </w:pPr>
       <w:r>
         <w:rPr>
           <w:rFonts w:hint="cs"/>
+          <w:highlight w:val="green"/>
           <w:rtl/>
         </w:rPr>
         <w:t xml:space="preserve">اظهار اسماء الفايلات التي تم اختيارها وليس فقط </w:t>
       </w:r>
       <w:r>
+        <w:rPr>
+          <w:highlight w:val="green"/>
+        </w:rPr>
         <w:t xml:space="preserve">2 file selected </w:t>
       </w:r>
       <w:r>
         <w:rPr>
           <w:rFonts w:hint="cs"/>
+          <w:highlight w:val="green"/>
           <w:rtl/>
           <w:lang w:bidi="ar-EG"/>
         </w:rPr>
@@ -345,6 +461,7 @@
       </w:r>
       <w:r>
         <w:rPr>
+          <w:highlight w:val="green"/>
           <w:lang w:bidi="ar-EG"/>
         </w:rPr>
         <w:t xml:space="preserve">pdf </w:t>
@@ -352,6 +469,7 @@
       <w:r>
         <w:rPr>
           <w:rFonts w:hint="cs"/>
+          <w:highlight w:val="green"/>
           <w:rtl/>
           <w:lang w:bidi="ar-EG"/>
         </w:rPr>
@@ -360,6 +478,7 @@
       <w:proofErr w:type="spellStart"/>
       <w:r>
         <w:rPr>
+          <w:highlight w:val="green"/>
           <w:lang w:bidi="ar-EG"/>
         </w:rPr>
         <w:t>png</w:t>
@@ -367,6 +486,7 @@
       <w:proofErr w:type="spellEnd"/>
       <w:r>
         <w:rPr>
+          <w:highlight w:val="green"/>
           <w:lang w:bidi="ar-EG"/>
         </w:rPr>
         <w:t xml:space="preserve"> </w:t>
@@ -374,6 +494,7 @@
       <w:r>
         <w:rPr>
           <w:rFonts w:hint="cs"/>
+          <w:highlight w:val="green"/>
           <w:rtl/>
           <w:lang w:bidi="ar-EG"/>
         </w:rPr>
@@ -388,10 +509,14 @@
           <w:numId w:val="3"/>
         </w:numPr>
         <w:bidi/>
+        <w:rPr>
+          <w:highlight w:val="green"/>
+        </w:rPr>
       </w:pPr>
       <w:r>
         <w:rPr>
           <w:rFonts w:hint="cs"/>
+          <w:highlight w:val="green"/>
           <w:rtl/>
           <w:lang w:bidi="ar-EG"/>
         </w:rPr>
@@ -406,10 +531,14 @@
           <w:numId w:val="3"/>
         </w:numPr>
         <w:bidi/>
+        <w:rPr>
+          <w:highlight w:val="green"/>
+        </w:rPr>
       </w:pPr>
       <w:r>
         <w:rPr>
           <w:rFonts w:hint="cs"/>
+          <w:highlight w:val="green"/>
           <w:rtl/>
           <w:lang w:bidi="ar-EG"/>
         </w:rPr>
@@ -418,6 +547,7 @@
       <w:r>
         <w:rPr>
           <w:rFonts w:hint="cs"/>
+          <w:highlight w:val="green"/>
           <w:rtl/>
           <w:lang w:bidi="ar-EG"/>
         </w:rPr>
@@ -431,6 +561,38 @@
           <w:ilvl w:val="0"/>
           <w:numId w:val="3"/>
         </w:numPr>
+        <w:bidi/>
+      </w:pPr>
+      <w:r>
+        <w:rPr>
+          <w:rFonts w:hint="cs"/>
+          <w:rtl/>
+          <w:lang w:bidi="ar-EG"/>
+        </w:rPr>
+        <w:t>امكانية ارسال الادمن رسالة للطرفين قبل التصرف المالي</w:t>
+      </w:r>
+    </w:p>
+    <w:p>
+      <w:pPr>
+        <w:pStyle w:val="ListParagraph"/>
+        <w:numPr>
+          <w:ilvl w:val="0"/>
+          <w:numId w:val="3"/>
+        </w:numPr>
+        <w:bidi/>
+      </w:pPr>
+      <w:r>
+        <w:rPr>
+          <w:rFonts w:hint="cs"/>
+          <w:rtl/>
+          <w:lang w:bidi="ar-EG"/>
+        </w:rPr>
+        <w:t>ماذا يحدث بعد حل النزاع لاي من الطرفين، المهمة لازات لم تكتمل</w:t>
+      </w:r>
+    </w:p>
+    <w:p>
+      <w:pPr>
+        <w:pStyle w:val="ListParagraph"/>
         <w:bidi/>
       </w:pPr>
     </w:p>
@@ -1644,6 +1806,7 @@
           <w:rtl/>
           <w:lang w:bidi="ar-EG"/>
         </w:rPr>
+        <w:lastRenderedPageBreak/>
         <w:t xml:space="preserve">اريد اخفاء استمارة تقديم العرض للمزايد الذي قدم عرضا بالفعل </w:t>
       </w:r>
     </w:p>
@@ -1704,7 +1867,6 @@
           <w:highlight w:val="green"/>
           <w:rtl/>
         </w:rPr>
-        <w:lastRenderedPageBreak/>
         <w:t xml:space="preserve"> </w:t>
       </w:r>
       <w:r>
@@ -2506,6 +2668,7 @@
         <w:rPr>
           <w:lang w:bidi="ar-EG"/>
         </w:rPr>
+        <w:lastRenderedPageBreak/>
         <w:t xml:space="preserve">{{ </w:t>
       </w:r>
       <w:proofErr w:type="spellStart"/>

</xml_diff>

<commit_message>
Update TaskService and UI
Modified TaskService to update notification URL path. Updated `CATEGORIES` in `browse.component.ts` to rename "Music & Audio" to "Audio" and removed category pills UI. Updated the binary Word document `مهام.docx`.
</commit_message>
<xml_diff>
--- a/مهام.docx
+++ b/مهام.docx
@@ -6,6 +6,10 @@
       <w:pPr>
         <w:bidi/>
         <w:ind w:left="720" w:hanging="360"/>
+        <w:rPr>
+          <w:rFonts w:hint="cs"/>
+          <w:lang w:bidi="ar-EG"/>
+        </w:rPr>
       </w:pPr>
     </w:p>
     <w:p>
@@ -359,13 +363,13 @@
         </w:numPr>
         <w:bidi/>
         <w:rPr>
-          <w:highlight w:val="yellow"/>
+          <w:highlight w:val="green"/>
         </w:rPr>
       </w:pPr>
       <w:r>
         <w:rPr>
           <w:rFonts w:hint="cs"/>
-          <w:highlight w:val="yellow"/>
+          <w:highlight w:val="green"/>
           <w:rtl/>
         </w:rPr>
         <w:t>عايزة الاشعارات تبقى موجهة مثلا طلب منك تعديل تذهب للصفحة التي تلائمها وهي صفحة تسليم العمل وهكذا كل الاشعا</w:t>
@@ -373,7 +377,7 @@
       <w:r>
         <w:rPr>
           <w:rFonts w:hint="cs"/>
-          <w:highlight w:val="yellow"/>
+          <w:highlight w:val="green"/>
           <w:rtl/>
           <w:lang w:bidi="ar-EG"/>
         </w:rPr>
@@ -381,7 +385,7 @@
       </w:r>
       <w:r>
         <w:rPr>
-          <w:highlight w:val="yellow"/>
+          <w:highlight w:val="green"/>
           <w:rtl/>
           <w:lang w:bidi="ar-EG"/>
         </w:rPr>
@@ -390,7 +394,7 @@
       <w:r>
         <w:rPr>
           <w:rFonts w:hint="cs"/>
-          <w:highlight w:val="yellow"/>
+          <w:highlight w:val="green"/>
           <w:rtl/>
           <w:lang w:bidi="ar-EG"/>
         </w:rPr>
@@ -405,20 +409,28 @@
           <w:numId w:val="3"/>
         </w:numPr>
         <w:bidi/>
+        <w:rPr>
+          <w:highlight w:val="green"/>
+        </w:rPr>
       </w:pPr>
       <w:r>
         <w:rPr>
           <w:rFonts w:hint="cs"/>
+          <w:highlight w:val="green"/>
           <w:rtl/>
         </w:rPr>
         <w:t>تنقية كل المدخلات بال</w:t>
       </w:r>
       <w:r>
+        <w:rPr>
+          <w:highlight w:val="green"/>
+        </w:rPr>
         <w:t xml:space="preserve">ai service </w:t>
       </w:r>
       <w:r>
         <w:rPr>
           <w:rFonts w:hint="cs"/>
+          <w:highlight w:val="green"/>
           <w:rtl/>
         </w:rPr>
         <w:t xml:space="preserve"> اي حاجة المستخدم هيكتب فيها بايده نص يتم تنقيتها اولا قبل نشرها ومنها ما تم انجازه التي تظهر للمستقل عند تسليم العمل وايضا ما تم تعديله وايضا ما التعديل المطلوب التي تظهر للعميل وايضا سبب النزاع التي تظهر للعميل</w:t>
@@ -432,13 +444,64 @@
           <w:numId w:val="3"/>
         </w:numPr>
         <w:bidi/>
-        <w:rPr>
-          <w:highlight w:val="green"/>
-        </w:rPr>
-      </w:pPr>
+      </w:pPr>
+      <w:r>
+        <w:t xml:space="preserve">Accept delivary modal </w:t>
+      </w:r>
       <w:r>
         <w:rPr>
           <w:rFonts w:hint="cs"/>
+          <w:rtl/>
+          <w:lang w:bidi="ar-EG"/>
+        </w:rPr>
+        <w:t>انجليزي فقط</w:t>
+      </w:r>
+    </w:p>
+    <w:p>
+      <w:pPr>
+        <w:pStyle w:val="ListParagraph"/>
+        <w:numPr>
+          <w:ilvl w:val="0"/>
+          <w:numId w:val="3"/>
+        </w:numPr>
+        <w:bidi/>
+      </w:pPr>
+      <w:r>
+        <w:t>Your delivery is under client review.</w:t>
+      </w:r>
+      <w:r>
+        <w:rPr>
+          <w:rFonts w:hint="cs"/>
+          <w:rtl/>
+        </w:rPr>
+        <w:t xml:space="preserve"> بتفضل في </w:t>
+      </w:r>
+      <w:r>
+        <w:t>task details</w:t>
+      </w:r>
+      <w:r>
+        <w:rPr>
+          <w:rFonts w:hint="cs"/>
+          <w:rtl/>
+        </w:rPr>
+        <w:t xml:space="preserve"> حتى بعد التسليم او حل النزاع </w:t>
+      </w:r>
+    </w:p>
+    <w:p>
+      <w:pPr>
+        <w:pStyle w:val="ListParagraph"/>
+        <w:numPr>
+          <w:ilvl w:val="0"/>
+          <w:numId w:val="3"/>
+        </w:numPr>
+        <w:bidi/>
+        <w:rPr>
+          <w:highlight w:val="green"/>
+        </w:rPr>
+      </w:pPr>
+      <w:r>
+        <w:rPr>
+          <w:rFonts w:hint="cs"/>
           <w:highlight w:val="green"/>
           <w:rtl/>
         </w:rPr>
@@ -475,21 +538,12 @@
         </w:rPr>
         <w:t xml:space="preserve">او </w:t>
       </w:r>
-      <w:proofErr w:type="spellStart"/>
-      <w:r>
-        <w:rPr>
-          <w:highlight w:val="green"/>
-          <w:lang w:bidi="ar-EG"/>
-        </w:rPr>
-        <w:t>png</w:t>
-      </w:r>
-      <w:proofErr w:type="spellEnd"/>
-      <w:r>
-        <w:rPr>
-          <w:highlight w:val="green"/>
-          <w:lang w:bidi="ar-EG"/>
-        </w:rPr>
-        <w:t xml:space="preserve"> </w:t>
+      <w:r>
+        <w:rPr>
+          <w:highlight w:val="green"/>
+          <w:lang w:bidi="ar-EG"/>
+        </w:rPr>
+        <w:t xml:space="preserve">png </w:t>
       </w:r>
       <w:r>
         <w:rPr>
@@ -588,6 +642,56 @@
           <w:lang w:bidi="ar-EG"/>
         </w:rPr>
         <w:t>ماذا يحدث بعد حل النزاع لاي من الطرفين، المهمة لازات لم تكتمل</w:t>
+      </w:r>
+    </w:p>
+    <w:p>
+      <w:pPr>
+        <w:pStyle w:val="ListParagraph"/>
+        <w:numPr>
+          <w:ilvl w:val="0"/>
+          <w:numId w:val="3"/>
+        </w:numPr>
+        <w:bidi/>
+      </w:pPr>
+      <w:r>
+        <w:rPr>
+          <w:lang w:bidi="ar-EG"/>
+        </w:rPr>
+        <w:t xml:space="preserve">Reload </w:t>
+      </w:r>
+      <w:r>
+        <w:rPr>
+          <w:rFonts w:hint="cs"/>
+          <w:rtl/>
+          <w:lang w:bidi="ar-EG"/>
+        </w:rPr>
+        <w:t>علشان يحس بالاشعارات و</w:t>
+      </w:r>
+      <w:r>
+        <w:rPr>
+          <w:rFonts w:hint="cs"/>
+          <w:rtl/>
+          <w:lang w:bidi="ar-EG"/>
+        </w:rPr>
+        <w:t>علشان يعرف ان انا اللي بعتت الرسائل مش الطرف الاخر</w:t>
+      </w:r>
+    </w:p>
+    <w:p>
+      <w:pPr>
+        <w:pStyle w:val="ListParagraph"/>
+        <w:numPr>
+          <w:ilvl w:val="0"/>
+          <w:numId w:val="3"/>
+        </w:numPr>
+        <w:bidi/>
+      </w:pPr>
+      <w:r>
+        <w:rPr>
+          <w:rFonts w:hint="cs"/>
+          <w:rtl/>
+          <w:lang w:bidi="ar-EG"/>
+        </w:rPr>
+        <w:t>تمت اعادة الصياغة في رسائل الشات تظهر فقط لي وليست للطرف الاخر</w:t>
       </w:r>
     </w:p>
     <w:p>
@@ -1553,6 +1657,7 @@
           <w:rtl/>
           <w:lang w:bidi="ar-EG"/>
         </w:rPr>
+        <w:lastRenderedPageBreak/>
         <w:t>زر اكتب رسال</w:t>
       </w:r>
       <w:r>
@@ -1806,7 +1911,6 @@
           <w:rtl/>
           <w:lang w:bidi="ar-EG"/>
         </w:rPr>
-        <w:lastRenderedPageBreak/>
         <w:t xml:space="preserve">اريد اخفاء استمارة تقديم العرض للمزايد الذي قدم عرضا بالفعل </w:t>
       </w:r>
     </w:p>
@@ -2396,23 +2500,13 @@
         </w:rPr>
         <w:t>رسائل الخطأ عربي -</w:t>
       </w:r>
-      <w:proofErr w:type="spellStart"/>
-      <w:r>
-        <w:rPr>
-          <w:rFonts w:cs="Arial"/>
-          <w:highlight w:val="green"/>
-          <w:lang w:bidi="ar-EG"/>
-        </w:rPr>
-        <w:t>en</w:t>
-      </w:r>
-      <w:proofErr w:type="spellEnd"/>
-      <w:r>
-        <w:rPr>
-          <w:rFonts w:cs="Arial"/>
-          <w:highlight w:val="green"/>
-          <w:lang w:bidi="ar-EG"/>
-        </w:rPr>
-        <w:t xml:space="preserve"> </w:t>
+      <w:r>
+        <w:rPr>
+          <w:rFonts w:cs="Arial"/>
+          <w:highlight w:val="green"/>
+          <w:lang w:bidi="ar-EG"/>
+        </w:rPr>
+        <w:t xml:space="preserve">en </w:t>
       </w:r>
     </w:p>
     <w:p>
@@ -2542,7 +2636,6 @@
         </w:rPr>
         <w:t xml:space="preserve"> هو يعمل ك </w:t>
       </w:r>
-      <w:proofErr w:type="spellStart"/>
       <w:r>
         <w:rPr>
           <w:rFonts w:cs="Arial"/>
@@ -2551,7 +2644,6 @@
         </w:rPr>
         <w:t>rtl-ltr</w:t>
       </w:r>
-      <w:proofErr w:type="spellEnd"/>
       <w:r>
         <w:rPr>
           <w:rFonts w:cs="Arial" w:hint="cs"/>
@@ -2642,174 +2734,57 @@
         </w:rPr>
         <w:t xml:space="preserve">  </w:t>
       </w:r>
-      <w:proofErr w:type="gramStart"/>
-      <w:r>
-        <w:rPr>
-          <w:lang w:bidi="ar-EG"/>
-        </w:rPr>
-        <w:t>&lt;!--</w:t>
-      </w:r>
-      <w:proofErr w:type="gramEnd"/>
-      <w:r>
-        <w:rPr>
-          <w:lang w:bidi="ar-EG"/>
-        </w:rPr>
-        <w:t xml:space="preserve"> Before --&gt;</w:t>
-      </w:r>
-    </w:p>
-    <w:p>
-      <w:pPr>
-        <w:rPr>
-          <w:lang w:bidi="ar-EG"/>
-        </w:rPr>
-      </w:pPr>
-      <w:proofErr w:type="gramStart"/>
-      <w:r>
-        <w:rPr>
-          <w:lang w:bidi="ar-EG"/>
-        </w:rPr>
-        <w:lastRenderedPageBreak/>
-        <w:t xml:space="preserve">{{ </w:t>
-      </w:r>
-      <w:proofErr w:type="spellStart"/>
-      <w:r>
-        <w:rPr>
-          <w:lang w:bidi="ar-EG"/>
-        </w:rPr>
-        <w:t>p</w:t>
-      </w:r>
-      <w:proofErr w:type="gramEnd"/>
-      <w:r>
-        <w:rPr>
-          <w:lang w:bidi="ar-EG"/>
-        </w:rPr>
-        <w:t>.submittedAt</w:t>
-      </w:r>
-      <w:proofErr w:type="spellEnd"/>
-      <w:r>
-        <w:rPr>
-          <w:lang w:bidi="ar-EG"/>
-        </w:rPr>
-        <w:t xml:space="preserve"> | </w:t>
-      </w:r>
-      <w:proofErr w:type="spellStart"/>
-      <w:r>
-        <w:rPr>
-          <w:lang w:bidi="ar-EG"/>
-        </w:rPr>
-        <w:t>date:'d</w:t>
-      </w:r>
-      <w:proofErr w:type="spellEnd"/>
-      <w:r>
-        <w:rPr>
-          <w:lang w:bidi="ar-EG"/>
-        </w:rPr>
-        <w:t xml:space="preserve"> MMM</w:t>
-      </w:r>
-      <w:proofErr w:type="gramStart"/>
-      <w:r>
-        <w:rPr>
-          <w:lang w:bidi="ar-EG"/>
-        </w:rPr>
-        <w:t>' }</w:t>
-      </w:r>
-      <w:proofErr w:type="gramEnd"/>
-      <w:r>
-        <w:rPr>
-          <w:lang w:bidi="ar-EG"/>
-        </w:rPr>
-        <w:t>}</w:t>
-      </w:r>
-    </w:p>
-    <w:p>
-      <w:pPr>
-        <w:rPr>
-          <w:lang w:bidi="ar-EG"/>
-        </w:rPr>
-      </w:pPr>
-    </w:p>
-    <w:p>
-      <w:pPr>
-        <w:rPr>
-          <w:lang w:bidi="ar-EG"/>
-        </w:rPr>
-      </w:pPr>
-      <w:proofErr w:type="gramStart"/>
-      <w:r>
-        <w:rPr>
-          <w:lang w:bidi="ar-EG"/>
-        </w:rPr>
-        <w:t>&lt;!--</w:t>
-      </w:r>
-      <w:proofErr w:type="gramEnd"/>
-      <w:r>
-        <w:rPr>
-          <w:lang w:bidi="ar-EG"/>
-        </w:rPr>
-        <w:t xml:space="preserve"> After — Fix 10 --&gt;</w:t>
-      </w:r>
-    </w:p>
-    <w:p>
-      <w:pPr>
-        <w:rPr>
-          <w:lang w:bidi="ar-EG"/>
-        </w:rPr>
-      </w:pPr>
-      <w:proofErr w:type="gramStart"/>
-      <w:r>
-        <w:rPr>
-          <w:lang w:bidi="ar-EG"/>
-        </w:rPr>
-        <w:t xml:space="preserve">{{ </w:t>
-      </w:r>
-      <w:proofErr w:type="spellStart"/>
-      <w:r>
-        <w:rPr>
-          <w:lang w:bidi="ar-EG"/>
-        </w:rPr>
-        <w:t>p</w:t>
-      </w:r>
-      <w:proofErr w:type="gramEnd"/>
-      <w:r>
-        <w:rPr>
-          <w:lang w:bidi="ar-EG"/>
-        </w:rPr>
-        <w:t>.submittedAt</w:t>
-      </w:r>
-      <w:proofErr w:type="spellEnd"/>
-      <w:r>
-        <w:rPr>
-          <w:lang w:bidi="ar-EG"/>
-        </w:rPr>
-        <w:t xml:space="preserve"> | </w:t>
-      </w:r>
-      <w:proofErr w:type="spellStart"/>
-      <w:r>
-        <w:rPr>
-          <w:lang w:bidi="ar-EG"/>
-        </w:rPr>
-        <w:t>utcDate</w:t>
-      </w:r>
-      <w:proofErr w:type="spellEnd"/>
-      <w:r>
-        <w:rPr>
-          <w:lang w:bidi="ar-EG"/>
-        </w:rPr>
-        <w:t>:'date</w:t>
-      </w:r>
-      <w:proofErr w:type="gramStart"/>
-      <w:r>
-        <w:rPr>
-          <w:lang w:bidi="ar-EG"/>
-        </w:rPr>
-        <w:t>' }</w:t>
-      </w:r>
-      <w:proofErr w:type="gramEnd"/>
-      <w:r>
-        <w:rPr>
-          <w:lang w:bidi="ar-EG"/>
-        </w:rPr>
-        <w:t>}</w:t>
+      <w:r>
+        <w:rPr>
+          <w:lang w:bidi="ar-EG"/>
+        </w:rPr>
+        <w:t>&lt;!-- Before --&gt;</w:t>
+      </w:r>
+    </w:p>
+    <w:p>
+      <w:pPr>
+        <w:rPr>
+          <w:lang w:bidi="ar-EG"/>
+        </w:rPr>
+      </w:pPr>
+      <w:r>
+        <w:rPr>
+          <w:lang w:bidi="ar-EG"/>
+        </w:rPr>
+        <w:t>{{ p.submittedAt | date:'d MMM' }}</w:t>
+      </w:r>
+    </w:p>
+    <w:p>
+      <w:pPr>
+        <w:rPr>
+          <w:lang w:bidi="ar-EG"/>
+        </w:rPr>
+      </w:pPr>
+    </w:p>
+    <w:p>
+      <w:pPr>
+        <w:rPr>
+          <w:lang w:bidi="ar-EG"/>
+        </w:rPr>
+      </w:pPr>
+      <w:r>
+        <w:rPr>
+          <w:lang w:bidi="ar-EG"/>
+        </w:rPr>
+        <w:t>&lt;!-- After — Fix 10 --&gt;</w:t>
+      </w:r>
+    </w:p>
+    <w:p>
+      <w:pPr>
+        <w:rPr>
+          <w:lang w:bidi="ar-EG"/>
+        </w:rPr>
+      </w:pPr>
+      <w:r>
+        <w:rPr>
+          <w:lang w:bidi="ar-EG"/>
+        </w:rPr>
+        <w:t>{{ p.submittedAt | utcDate:'date' }}</w:t>
       </w:r>
     </w:p>
     <w:p>
@@ -3892,7 +3867,6 @@
   <w:style w:type="character" w:default="1" w:styleId="DefaultParagraphFont">
     <w:name w:val="Default Paragraph Font"/>
     <w:uiPriority w:val="1"/>
-    <w:semiHidden/>
     <w:unhideWhenUsed/>
   </w:style>
   <w:style w:type="table" w:default="1" w:styleId="TableNormal">

</xml_diff>